<commit_message>
Updating the SP page of the website.
</commit_message>
<xml_diff>
--- a/docs/chapters/ewg32_sp_docx.docx
+++ b/docs/chapters/ewg32_sp_docx.docx
@@ -1112,6 +1112,47 @@
       </w:pPr>
       <w:r>
         <w:t xml:space="preserve">The overall SP current status score for each region and year is the arithmetic mean of that region’s CCE, LSP, and ICO scores.</w:t>
+      </w:r>
+    </w:p>
+    <w:p>
+      <w:pPr>
+        <w:pStyle w:val="BodyText"/>
+      </w:pPr>
+      <w:r>
+        <w:rPr>
+          <w:bCs/>
+          <w:b/>
+        </w:rPr>
+        <w:t xml:space="preserve">Reporting years for overall SP and CCE:</w:t>
+      </w:r>
+      <w:r>
+        <w:t xml:space="preserve"> </w:t>
+      </w:r>
+      <w:r>
+        <w:rPr>
+          <w:bCs/>
+          <w:b/>
+        </w:rPr>
+        <w:t xml:space="preserve">2019-2025</w:t>
+      </w:r>
+      <w:r>
+        <w:t xml:space="preserve">. We hold overall scores at 2025 until the Ama tu Playa beach-adoption inventory is current for 2026. The program website list has not shown updated adoption counts for many months into 2026, so a 2026 Ama score (or a silent copy of 2025 into 2026) would not yet be representative. Extending overall CCE or SP into 2026 with only cultural places would also break year-to-year comparability, because CCE would no longer average both layers the way it does through 2025. Non-natural cultural places plots below still show</w:t>
+      </w:r>
+      <w:r>
+        <w:t xml:space="preserve"> </w:t>
+      </w:r>
+      <w:r>
+        <w:rPr>
+          <w:bCs/>
+          <w:b/>
+        </w:rPr>
+        <w:t xml:space="preserve">2019-2026</w:t>
+      </w:r>
+      <w:r>
+        <w:t xml:space="preserve"> </w:t>
+      </w:r>
+      <w:r>
+        <w:t xml:space="preserve">as a subcomponent trajectory for discussion, not as the years used in the composite scores.</w:t>
       </w:r>
     </w:p>
     <w:p>
@@ -1798,6 +1839,30 @@
         <w:pStyle w:val="BodyText"/>
       </w:pPr>
       <w:r>
+        <w:t xml:space="preserve">Overall CCE current status is shown for</w:t>
+      </w:r>
+      <w:r>
+        <w:t xml:space="preserve"> </w:t>
+      </w:r>
+      <w:r>
+        <w:rPr>
+          <w:bCs/>
+          <w:b/>
+        </w:rPr>
+        <w:t xml:space="preserve">2019-2025</w:t>
+      </w:r>
+      <w:r>
+        <w:t xml:space="preserve"> </w:t>
+      </w:r>
+      <w:r>
+        <w:t xml:space="preserve">only (see the note under Overall Sense of Place scores). The cultural places layer still plots through 2026 below so the group can see recent DENUE-based change without folding incomplete beach-adoption coverage into the composite.</w:t>
+      </w:r>
+    </w:p>
+    <w:p>
+      <w:pPr>
+        <w:pStyle w:val="BodyText"/>
+      </w:pPr>
+      <w:r>
         <w:drawing>
           <wp:inline>
             <wp:extent cx="5334000" cy="3429000"/>
@@ -2592,7 +2657,20 @@
         <w:pStyle w:val="Compact"/>
       </w:pPr>
       <w:r>
-        <w:t xml:space="preserve">Start with INEGI DENUE sector 71 for 2019-2024.</w:t>
+        <w:t xml:space="preserve">Start with INEGI DENUE sector 71 for</w:t>
+      </w:r>
+      <w:r>
+        <w:t xml:space="preserve"> </w:t>
+      </w:r>
+      <w:r>
+        <w:rPr>
+          <w:bCs/>
+          <w:b/>
+        </w:rPr>
+        <w:t xml:space="preserve">2019-2026</w:t>
+      </w:r>
+      <w:r>
+        <w:t xml:space="preserve">.</w:t>
       </w:r>
     </w:p>
     <w:p>
@@ -3011,13 +3089,54 @@
           <w:bCs/>
           <w:b/>
         </w:rPr>
-        <w:t xml:space="preserve">Temporary 2025 gapfill:</w:t>
-      </w:r>
-      <w:r>
-        <w:t xml:space="preserve"> </w:t>
-      </w:r>
-      <w:r>
-        <w:t xml:space="preserve">DENUE 2025 is not yet available. For the SP merge, 2025 is temporarily copied from 2024 until DENUE 2025 is released. The observed 2019-2024 series remains unchanged so this can be reversed later.</w:t>
+        <w:t xml:space="preserve">Years:</w:t>
+      </w:r>
+      <w:r>
+        <w:t xml:space="preserve"> </w:t>
+      </w:r>
+      <w:r>
+        <w:t xml:space="preserve">The full cultural places series is</w:t>
+      </w:r>
+      <w:r>
+        <w:t xml:space="preserve"> </w:t>
+      </w:r>
+      <w:r>
+        <w:rPr>
+          <w:bCs/>
+          <w:b/>
+        </w:rPr>
+        <w:t xml:space="preserve">2019-2026</w:t>
+      </w:r>
+      <w:r>
+        <w:t xml:space="preserve"> </w:t>
+      </w:r>
+      <w:r>
+        <w:t xml:space="preserve">(updated DENUE prep:</w:t>
+      </w:r>
+      <w:r>
+        <w:t xml:space="preserve"> </w:t>
+      </w:r>
+      <w:r>
+        <w:rPr>
+          <w:rStyle w:val="VerbatimChar"/>
+        </w:rPr>
+        <w:t xml:space="preserve">non_natural_cultural_places_2019_2026_goc_10km.shp</w:t>
+      </w:r>
+      <w:r>
+        <w:t xml:space="preserve">). We show 2026 here on purpose so the group can see recent direction of change for this subcomponent.</w:t>
+      </w:r>
+      <w:r>
+        <w:t xml:space="preserve"> </w:t>
+      </w:r>
+      <w:r>
+        <w:rPr>
+          <w:bCs/>
+          <w:b/>
+        </w:rPr>
+        <w:t xml:space="preserve">2026 is not yet included in overall CCE or SP</w:t>
+      </w:r>
+      <w:r>
+        <w:t xml:space="preserve">, because Ama tu Playa adoption inventory is not yet a reliable 2026 observation (see the note under overall scores). The temporary 2025-from-2024 gapfill is no longer used.</w:t>
       </w:r>
     </w:p>
     <w:p>
@@ -3041,7 +3160,7 @@
         <w:pStyle w:val="Compact"/>
       </w:pPr>
       <w:r>
-        <w:t xml:space="preserve">INEGI DENUE sector 71 cultural and recreation establishments within the inland 10 km coastal buffer; employees estimated from DENUE size classes, scaled to coastal locality population, referenced to the 75th quantile; 2025 temporarily copied from 2024 until DENUE 2025 is released</w:t>
+        <w:t xml:space="preserve">INEGI DENUE sector 71 cultural and recreation establishments within the inland 10 km coastal buffer; employees estimated from DENUE size classes, scaled to coastal locality population, referenced to the 75th quantile; series through 2026</w:t>
       </w:r>
     </w:p>
     <w:bookmarkEnd w:id="46"/>

</xml_diff>

<commit_message>
Updating SP page, fixing mistakes.
</commit_message>
<xml_diff>
--- a/docs/chapters/ewg32_sp_docx.docx
+++ b/docs/chapters/ewg32_sp_docx.docx
@@ -1190,7 +1190,7 @@
           <w:bCs/>
           <w:b/>
         </w:rPr>
-        <w:t xml:space="preserve">Reporting years for overall SP and CCE:</w:t>
+        <w:t xml:space="preserve">Reporting years for overall SP:</w:t>
       </w:r>
       <w:r>
         <w:t xml:space="preserve"> </w:t>
@@ -1203,23 +1203,7 @@
         <w:t xml:space="preserve">2019-2025</w:t>
       </w:r>
       <w:r>
-        <w:t xml:space="preserve">. We will not update overall scores to 2026 until the Ama tu Playa beach adoption inventory is current for 2026. The program website list has not shown updated adoption counts for many months into 2026, so a 2026 Ama score (or a copy of 2025 into 2026) would not yet be representative. Extending overall CCE or SP into 2026 with only cultural places would also break comparability from year to year, because CCE would no longer average both layers the way it does through 2025. Non-natural cultural places plots below still show</w:t>
-      </w:r>
-      <w:r>
-        <w:t xml:space="preserve"> </w:t>
-      </w:r>
-      <w:r>
-        <w:rPr>
-          <w:bCs/>
-          <w:b/>
-        </w:rPr>
-        <w:t xml:space="preserve">2019-2026</w:t>
-      </w:r>
-      <w:r>
-        <w:t xml:space="preserve"> </w:t>
-      </w:r>
-      <w:r>
-        <w:t xml:space="preserve">as a subcomponent trajectory for discussion, not as the years used in the composite scores.</w:t>
+        <w:t xml:space="preserve">. We will not update overall scores past 2025 until all data sources have been updated through 2026.</w:t>
       </w:r>
     </w:p>
     <w:p>
@@ -1231,7 +1215,7 @@
           <wp:inline>
             <wp:extent cx="5334000" cy="5334000"/>
             <wp:effectExtent b="0" l="0" r="0" t="0"/>
-            <wp:docPr descr="Figure 1. Regional Sense of Place current status scores over time for each of the nine OHI Gulf of California regions. For every region and year, Sense of Place is the equal-weight average of three subgoals: Coastal Community Engagement (CCE), Lasting Special Places (LSP), and Iconic Species (ICO). A score of 100 represents the reference condition we treat as a full, ideal status; lower values mean weaker estimated condition. Years shown are 2019 through 2025, which is the window used for overall SP until beach-adoption inventory data can support a full 2026 composite." title="" id="32" name="Picture"/>
+            <wp:docPr descr="Figure 1. Regional Sense of Place current status scores over time for each of the nine OHI Gulf of California regions. For every region and year, Sense of Place is the equal-weight average of three subgoals: Coastal Community Engagement (CCE), Lasting Special Places (LSP), and Iconic Species (ICO). A score of 100 represents the reference condition we treat as an ideal status; lower values represent lower estimated condition. Years shown are 2019 through 2025." title="" id="32" name="Picture"/>
             <a:graphic>
               <a:graphicData uri="http://schemas.openxmlformats.org/drawingml/2006/picture">
                 <pic:pic>
@@ -1274,7 +1258,7 @@
         <w:pStyle w:val="ImageCaption"/>
       </w:pPr>
       <w:r>
-        <w:t xml:space="preserve">Figure 1. Regional Sense of Place current status scores over time for each of the nine OHI Gulf of California regions. For every region and year, Sense of Place is the equal-weight average of three subgoals: Coastal Community Engagement (CCE), Lasting Special Places (LSP), and Iconic Species (ICO). A score of 100 represents the reference condition we treat as a full, ideal status; lower values mean weaker estimated condition. Years shown are 2019 through 2025, which is the window used for overall SP until beach-adoption inventory data can support a full 2026 composite.</w:t>
+        <w:t xml:space="preserve">Figure 1. Regional Sense of Place current status scores over time for each of the nine OHI Gulf of California regions. For every region and year, Sense of Place is the equal-weight average of three subgoals: Coastal Community Engagement (CCE), Lasting Special Places (LSP), and Iconic Species (ICO). A score of 100 represents the reference condition we treat as an ideal status; lower values represent lower estimated condition. Years shown are 2019 through 2025.</w:t>
       </w:r>
     </w:p>
     <w:bookmarkStart w:id="37" w:name="gulf-wide-average-sp-current-status"/>
@@ -1523,7 +1507,7 @@
     </w:p>
     <w:bookmarkEnd w:id="37"/>
     <w:bookmarkEnd w:id="38"/>
-    <w:bookmarkStart w:id="58" w:name="coastal-community-engagement-cce"/>
+    <w:bookmarkStart w:id="61" w:name="coastal-community-engagement-cce"/>
     <w:p>
       <w:pPr>
         <w:pStyle w:val="Heading1"/>
@@ -2468,7 +2452,7 @@
           <wp:inline>
             <wp:extent cx="5334000" cy="5334000"/>
             <wp:effectExtent b="0" l="0" r="0" t="0"/>
-            <wp:docPr descr="Figure 4. Beach adoptions layer of CCE: the share of SEMARNAT Ama tu Playa inventory beaches in each region that have already been formally adopted. Adoption means an organization has committed to keep that beach or coastal stretch clean under the 2025-2030 national beach strategy; we score stewardship through adoption share, not kilos of trash collected. For 2019-2024 the campaign has not started in our scoring rules, so adoptions are recorded as 0. Region 2 has no beaches in the program inventory after the spatial join and is shown carefully so absence is not mistaken for a perfect score." title="" id="44" name="Picture"/>
+            <wp:docPr descr="Figure 4. Beach adoptions layer of CCE: the share of SEMARNAT Ama tu Playa inventory beaches in each region that have already been formally adopted. Adoption means an organization has committed to keep that beach or coastal stretch clean under the 2025-2030 national beach strategy; we score stewardship through adoption share, not kilos of trash collected. For 2019-2024, the campaign had not started yet, so adoptions are recorded as 0. The Western Midriff Islands OHI region has no beaches in the program inventory." title="" id="44" name="Picture"/>
             <a:graphic>
               <a:graphicData uri="http://schemas.openxmlformats.org/drawingml/2006/picture">
                 <pic:pic>
@@ -2511,7 +2495,7 @@
         <w:pStyle w:val="ImageCaption"/>
       </w:pPr>
       <w:r>
-        <w:t xml:space="preserve">Figure 4. Beach adoptions layer of CCE: the share of SEMARNAT Ama tu Playa inventory beaches in each region that have already been formally adopted. Adoption means an organization has committed to keep that beach or coastal stretch clean under the 2025-2030 national beach strategy; we score stewardship through adoption share, not kilos of trash collected. For 2019-2024 the campaign has not started in our scoring rules, so adoptions are recorded as 0. Region 2 has no beaches in the program inventory after the spatial join and is shown carefully so absence is not mistaken for a perfect score.</w:t>
+        <w:t xml:space="preserve">Figure 4. Beach adoptions layer of CCE: the share of SEMARNAT Ama tu Playa inventory beaches in each region that have already been formally adopted. Adoption means an organization has committed to keep that beach or coastal stretch clean under the 2025-2030 national beach strategy; we score stewardship through adoption share, not kilos of trash collected. For 2019-2024, the campaign had not started yet, so adoptions are recorded as 0. The Western Midriff Islands OHI region has no beaches in the program inventory.</w:t>
       </w:r>
     </w:p>
     <w:p>
@@ -2570,7 +2554,7 @@
       </w:r>
     </w:p>
     <w:bookmarkEnd w:id="49"/>
-    <w:bookmarkStart w:id="57" w:name="non-natural-cultural-places"/>
+    <w:bookmarkStart w:id="60" w:name="non-natural-cultural-places"/>
     <w:p>
       <w:pPr>
         <w:pStyle w:val="Heading2"/>
@@ -2587,50 +2571,275 @@
         <w:t xml:space="preserve">This CCE layer measures human-made cultural establishments near the Gulf coast that support community connection to place.</w:t>
       </w:r>
     </w:p>
-    <w:p>
-      <w:pPr>
-        <w:pStyle w:val="BodyText"/>
-      </w:pPr>
-      <w:r>
-        <w:t xml:space="preserve">::: {.callout-note collapse=</w:t>
-      </w:r>
-      <w:r>
-        <w:t xml:space="preserve">“</w:t>
-      </w:r>
-      <w:r>
-        <w:t xml:space="preserve">true</w:t>
-      </w:r>
-      <w:r>
-        <w:t xml:space="preserve">”</w:t>
-      </w:r>
-      <w:r>
-        <w:t xml:space="preserve">}</w:t>
-      </w:r>
-      <w:r>
-        <w:t xml:space="preserve"> </w:t>
-      </w:r>
-      <w:r>
-        <w:t xml:space="preserve">## Which cultural establishments are included?</w:t>
-      </w:r>
-    </w:p>
-    <w:p>
-      <w:pPr>
-        <w:pStyle w:val="BodyText"/>
-      </w:pPr>
-      <w:r>
-        <w:t xml:space="preserve">We start from INEGI DENUE sector 71 (</w:t>
-      </w:r>
-      <w:r>
-        <w:rPr>
-          <w:iCs/>
-          <w:i/>
-        </w:rPr>
-        <w:t xml:space="preserve">servicios de esparcimiento culturales y deportivos, y otros servicios recreativos</w:t>
-      </w:r>
-      <w:r>
-        <w:t xml:space="preserve">) and keep establishments that function as cultural economic units with a meaningful coastal connection, within the inland 10 km coastal buffer of the six Gulf of California states.</w:t>
-      </w:r>
-    </w:p>
+    <w:tbl>
+      <w:tblPr>
+        <w:tblStyle w:val="Table"/>
+        <w:tblLook w:firstRow="0" w:lastRow="0" w:firstColumn="0" w:lastColumn="0" w:noHBand="0" w:noVBand="0" w:val="0000"/>
+        <w:tblBorders>
+          <w:left w:val="single" w:sz="24" w:space="0" w:color="0758E5"/>
+          <w:right w:val="single" w:sz="4" w:space="0" w:color="0758E5"/>
+          <w:top w:val="single" w:sz="4" w:space="0" w:color="0758E5"/>
+          <w:bottom w:val="single" w:sz="4" w:space="0" w:color="0758E5"/>
+        </w:tblBorders>
+        <w:tblCellMar>
+          <w:left w:w="144" w:type="dxa"/>
+          <w:right w:w="144" w:type="dxa"/>
+        </w:tblCellMar>
+        <w:tblInd w:w="164" w:type="dxa"/>
+        <w:tblW w:type="pct" w:w="100%"/>
+      </w:tblPr>
+      <w:tr>
+        <w:trPr>
+          <w:cantSplit/>
+        </w:trPr>
+        <w:tc>
+          <w:tcPr>
+            <w:shd w:color="auto" w:fill="dae6fb" w:val="clear"/>
+            <w:tcMar>
+              <w:top w:w="92" w:type="dxa"/>
+              <w:bottom w:w="92" w:type="dxa"/>
+            </w:tcMar>
+          </w:tcPr>
+          <w:p>
+            <w:pPr>
+              <w:pStyle w:val="BodyText"/>
+            </w:pPr>
+            <w:pPr>
+              <w:spacing w:before="0" w:after="0"/>
+              <w:textAlignment w:val="center"/>
+            </w:pPr>
+            <w:r>
+              <w:drawing>
+                <wp:inline>
+                  <wp:extent cx="152400" cy="152400"/>
+                  <wp:effectExtent b="0" l="0" r="0" t="0"/>
+                  <wp:docPr descr="" title="" id="51" name="Picture"/>
+                  <a:graphic>
+                    <a:graphicData uri="http://schemas.openxmlformats.org/drawingml/2006/picture">
+                      <pic:pic>
+                        <pic:nvPicPr>
+                          <pic:cNvPr descr="/usr/lib/rstudio-server/bin/quarto/share/formats/docx/note.png" id="52" name="Picture"/>
+                          <pic:cNvPicPr>
+                            <a:picLocks noChangeArrowheads="1" noChangeAspect="1"/>
+                          </pic:cNvPicPr>
+                        </pic:nvPicPr>
+                        <pic:blipFill>
+                          <a:blip r:embed="rId50"/>
+                          <a:stretch>
+                            <a:fillRect/>
+                          </a:stretch>
+                        </pic:blipFill>
+                        <pic:spPr bwMode="auto">
+                          <a:xfrm>
+                            <a:off x="0" y="0"/>
+                            <a:ext cx="152400" cy="152400"/>
+                          </a:xfrm>
+                          <a:prstGeom prst="rect">
+                            <a:avLst/>
+                          </a:prstGeom>
+                          <a:noFill/>
+                          <a:ln w="9525">
+                            <a:noFill/>
+                            <a:headEnd/>
+                            <a:tailEnd/>
+                          </a:ln>
+                        </pic:spPr>
+                      </pic:pic>
+                    </a:graphicData>
+                  </a:graphic>
+                </wp:inline>
+              </w:drawing>
+            </w:r>
+            <w:r>
+              <w:t xml:space="preserve"> </w:t>
+            </w:r>
+            <w:r>
+              <w:t xml:space="preserve"> </w:t>
+            </w:r>
+            <w:r>
+              <w:t xml:space="preserve">Which cultural establishments are included?</w:t>
+            </w:r>
+          </w:p>
+        </w:tc>
+      </w:tr>
+      <w:tr>
+        <w:trPr>
+          <w:cantSplit/>
+        </w:trPr>
+        <w:tc>
+          <w:tcPr>
+            <w:tcMar>
+              <w:top w:w="108" w:type="dxa"/>
+              <w:bottom w:w="108" w:type="dxa"/>
+            </w:tcMar>
+          </w:tcPr>
+          <w:p>
+            <w:pPr>
+              <w:pStyle w:val="BodyText"/>
+            </w:pPr>
+            <w:pPr>
+              <w:spacing w:before="16"/>
+            </w:pPr>
+            <w:r>
+              <w:t xml:space="preserve">We start from INEGI DENUE sector 71 (</w:t>
+            </w:r>
+            <w:r>
+              <w:rPr>
+                <w:iCs/>
+                <w:i/>
+              </w:rPr>
+              <w:t xml:space="preserve">servicios de esparcimiento culturales y deportivos, y otros servicios recreativos</w:t>
+            </w:r>
+            <w:r>
+              <w:t xml:space="preserve">) and keep establishments that function as cultural economic units with a meaningful coastal connection, within the inland 10 km coastal buffer of the six Gulf of California states.</w:t>
+            </w:r>
+          </w:p>
+          <w:p>
+            <w:pPr>
+              <w:pStyle w:val="BodyText"/>
+            </w:pPr>
+            <w:r>
+              <w:rPr>
+                <w:bCs/>
+                <w:b/>
+              </w:rPr>
+              <w:t xml:space="preserve">Examples of establishment types retained</w:t>
+            </w:r>
+          </w:p>
+          <w:p>
+            <w:pPr>
+              <w:numPr>
+                <w:ilvl w:val="0"/>
+                <w:numId w:val="1007"/>
+              </w:numPr>
+              <w:pStyle w:val="Compact"/>
+            </w:pPr>
+            <w:r>
+              <w:t xml:space="preserve">Theaters and other performing arts venues</w:t>
+            </w:r>
+          </w:p>
+          <w:p>
+            <w:pPr>
+              <w:numPr>
+                <w:ilvl w:val="0"/>
+                <w:numId w:val="1007"/>
+              </w:numPr>
+              <w:pStyle w:val="Compact"/>
+            </w:pPr>
+            <w:r>
+              <w:t xml:space="preserve">Museums and cultural exhibition spaces</w:t>
+            </w:r>
+          </w:p>
+          <w:p>
+            <w:pPr>
+              <w:numPr>
+                <w:ilvl w:val="0"/>
+                <w:numId w:val="1007"/>
+              </w:numPr>
+              <w:pStyle w:val="Compact"/>
+            </w:pPr>
+            <w:r>
+              <w:t xml:space="preserve">Historic sites and related heritage establishments</w:t>
+            </w:r>
+          </w:p>
+          <w:p>
+            <w:pPr>
+              <w:numPr>
+                <w:ilvl w:val="0"/>
+                <w:numId w:val="1007"/>
+              </w:numPr>
+              <w:pStyle w:val="Compact"/>
+            </w:pPr>
+            <w:r>
+              <w:t xml:space="preserve">Botanical gardens and similar nature-culture venues</w:t>
+            </w:r>
+          </w:p>
+          <w:p>
+            <w:pPr>
+              <w:numPr>
+                <w:ilvl w:val="0"/>
+                <w:numId w:val="1007"/>
+              </w:numPr>
+              <w:pStyle w:val="Compact"/>
+            </w:pPr>
+            <w:r>
+              <w:t xml:space="preserve">Public parks and recreation spaces with cultural connection</w:t>
+            </w:r>
+          </w:p>
+          <w:p>
+            <w:pPr>
+              <w:numPr>
+                <w:ilvl w:val="0"/>
+                <w:numId w:val="1007"/>
+              </w:numPr>
+              <w:pStyle w:val="Compact"/>
+            </w:pPr>
+            <w:r>
+              <w:t xml:space="preserve">Coastal recreation establishments that support place-based coastal use</w:t>
+            </w:r>
+          </w:p>
+          <w:p>
+            <w:pPr>
+              <w:pStyle w:val="FirstParagraph"/>
+            </w:pPr>
+            <w:r>
+              <w:rPr>
+                <w:bCs/>
+                <w:b/>
+              </w:rPr>
+              <w:t xml:space="preserve">Examples excluded</w:t>
+            </w:r>
+          </w:p>
+          <w:p>
+            <w:pPr>
+              <w:numPr>
+                <w:ilvl w:val="0"/>
+                <w:numId w:val="1008"/>
+              </w:numPr>
+              <w:pStyle w:val="Compact"/>
+            </w:pPr>
+            <w:r>
+              <w:t xml:space="preserve">Charreadas (for example establishments named LIENZO CHARRO)</w:t>
+            </w:r>
+          </w:p>
+          <w:p>
+            <w:pPr>
+              <w:numPr>
+                <w:ilvl w:val="0"/>
+                <w:numId w:val="1008"/>
+              </w:numPr>
+              <w:pStyle w:val="Compact"/>
+            </w:pPr>
+            <w:r>
+              <w:t xml:space="preserve">Cockfighting venues (for example GALLERA)</w:t>
+            </w:r>
+          </w:p>
+          <w:p>
+            <w:pPr>
+              <w:numPr>
+                <w:ilvl w:val="0"/>
+                <w:numId w:val="1008"/>
+              </w:numPr>
+              <w:pStyle w:val="Compact"/>
+            </w:pPr>
+            <w:r>
+              <w:t xml:space="preserve">Selected administrative businesses identified by name that do not represent community cultural engagement with the coast</w:t>
+            </w:r>
+          </w:p>
+          <w:p>
+            <w:pPr>
+              <w:pStyle w:val="FirstParagraph"/>
+            </w:pPr>
+            <w:pPr>
+              <w:spacing w:after="16"/>
+            </w:pPr>
+            <w:r>
+              <w:t xml:space="preserve">The intent is to count places where people gather around coastal culture, heritage, and recreation, not every establishment that happens to fall under the broad DENUE culture and recreation sector.</w:t>
+            </w:r>
+          </w:p>
+        </w:tc>
+      </w:tr>
+    </w:tbl>
     <w:p>
       <w:pPr>
         <w:pStyle w:val="BodyText"/>
@@ -2640,147 +2849,32 @@
           <w:bCs/>
           <w:b/>
         </w:rPr>
-        <w:t xml:space="preserve">Examples of establishment types retained</w:t>
-      </w:r>
-    </w:p>
-    <w:p>
-      <w:pPr>
-        <w:numPr>
-          <w:ilvl w:val="0"/>
-          <w:numId w:val="1007"/>
-        </w:numPr>
-        <w:pStyle w:val="Compact"/>
-      </w:pPr>
-      <w:r>
-        <w:t xml:space="preserve">Theaters and other performing arts venues</w:t>
-      </w:r>
-    </w:p>
-    <w:p>
-      <w:pPr>
-        <w:numPr>
-          <w:ilvl w:val="0"/>
-          <w:numId w:val="1007"/>
-        </w:numPr>
-        <w:pStyle w:val="Compact"/>
-      </w:pPr>
-      <w:r>
-        <w:t xml:space="preserve">Museums and cultural exhibition spaces</w:t>
-      </w:r>
-    </w:p>
-    <w:p>
-      <w:pPr>
-        <w:numPr>
-          <w:ilvl w:val="0"/>
-          <w:numId w:val="1007"/>
-        </w:numPr>
-        <w:pStyle w:val="Compact"/>
-      </w:pPr>
-      <w:r>
-        <w:t xml:space="preserve">Historic sites and related heritage establishments</w:t>
-      </w:r>
-    </w:p>
-    <w:p>
-      <w:pPr>
-        <w:numPr>
-          <w:ilvl w:val="0"/>
-          <w:numId w:val="1007"/>
-        </w:numPr>
-        <w:pStyle w:val="Compact"/>
-      </w:pPr>
-      <w:r>
-        <w:t xml:space="preserve">Botanical gardens and similar nature-culture venues</w:t>
-      </w:r>
-    </w:p>
-    <w:p>
-      <w:pPr>
-        <w:numPr>
-          <w:ilvl w:val="0"/>
-          <w:numId w:val="1007"/>
-        </w:numPr>
-        <w:pStyle w:val="Compact"/>
-      </w:pPr>
-      <w:r>
-        <w:t xml:space="preserve">Public parks and recreation spaces with cultural connection</w:t>
-      </w:r>
-    </w:p>
-    <w:p>
-      <w:pPr>
-        <w:numPr>
-          <w:ilvl w:val="0"/>
-          <w:numId w:val="1007"/>
-        </w:numPr>
-        <w:pStyle w:val="Compact"/>
-      </w:pPr>
-      <w:r>
-        <w:t xml:space="preserve">Marinas and related coastal recreation establishments that support place-based coastal use</w:t>
-      </w:r>
-    </w:p>
-    <w:p>
-      <w:pPr>
-        <w:pStyle w:val="FirstParagraph"/>
-      </w:pPr>
+        <w:t xml:space="preserve">How the layer was built</w:t>
+      </w:r>
+    </w:p>
+    <w:p>
+      <w:pPr>
+        <w:numPr>
+          <w:ilvl w:val="0"/>
+          <w:numId w:val="1009"/>
+        </w:numPr>
+        <w:pStyle w:val="Compact"/>
+      </w:pPr>
+      <w:r>
+        <w:t xml:space="preserve">Start with INEGI DENUE sector 71 for</w:t>
+      </w:r>
+      <w:r>
+        <w:t xml:space="preserve"> </w:t>
+      </w:r>
       <w:r>
         <w:rPr>
           <w:bCs/>
           <w:b/>
         </w:rPr>
-        <w:t xml:space="preserve">Examples excluded</w:t>
-      </w:r>
-    </w:p>
-    <w:p>
-      <w:pPr>
-        <w:numPr>
-          <w:ilvl w:val="0"/>
-          <w:numId w:val="1008"/>
-        </w:numPr>
-        <w:pStyle w:val="Compact"/>
-      </w:pPr>
-      <w:r>
-        <w:t xml:space="preserve">Charreadas (for example establishments named LIENZO CHARRO)</w:t>
-      </w:r>
-    </w:p>
-    <w:p>
-      <w:pPr>
-        <w:numPr>
-          <w:ilvl w:val="0"/>
-          <w:numId w:val="1008"/>
-        </w:numPr>
-        <w:pStyle w:val="Compact"/>
-      </w:pPr>
-      <w:r>
-        <w:t xml:space="preserve">Cockfighting venues (for example GALLERA)</w:t>
-      </w:r>
-    </w:p>
-    <w:p>
-      <w:pPr>
-        <w:numPr>
-          <w:ilvl w:val="0"/>
-          <w:numId w:val="1008"/>
-        </w:numPr>
-        <w:pStyle w:val="Compact"/>
-      </w:pPr>
-      <w:r>
-        <w:t xml:space="preserve">Selected administrative businesses identified by name that do not represent community cultural engagement with the coast</w:t>
-      </w:r>
-    </w:p>
-    <w:p>
-      <w:pPr>
-        <w:pStyle w:val="FirstParagraph"/>
-      </w:pPr>
-      <w:r>
-        <w:t xml:space="preserve">The intent is to count places where people gather around coastal culture, heritage, and recreation, not every establishment that happens to fall under the broad DENUE recreation sector.</w:t>
-      </w:r>
-    </w:p>
-    <w:p>
-      <w:pPr>
-        <w:pStyle w:val="BodyText"/>
-      </w:pPr>
-      <w:r>
-        <w:rPr>
-          <w:bCs/>
-          <w:b/>
-        </w:rPr>
-        <w:t xml:space="preserve">How the layer was built</w:t>
+        <w:t xml:space="preserve">2019-2026</w:t>
+      </w:r>
+      <w:r>
+        <w:t xml:space="preserve">.</w:t>
       </w:r>
     </w:p>
     <w:p>
@@ -2792,20 +2886,7 @@
         <w:pStyle w:val="Compact"/>
       </w:pPr>
       <w:r>
-        <w:t xml:space="preserve">Start with INEGI DENUE sector 71 for</w:t>
-      </w:r>
-      <w:r>
-        <w:t xml:space="preserve"> </w:t>
-      </w:r>
-      <w:r>
-        <w:rPr>
-          <w:bCs/>
-          <w:b/>
-        </w:rPr>
-        <w:t xml:space="preserve">2019-2026</w:t>
-      </w:r>
-      <w:r>
-        <w:t xml:space="preserve">.</w:t>
+        <w:t xml:space="preserve">Restrict to the six GoC states and keep only establishments inside the inland 10 km coastal buffer.</w:t>
       </w:r>
     </w:p>
     <w:p>
@@ -2817,19 +2898,7 @@
         <w:pStyle w:val="Compact"/>
       </w:pPr>
       <w:r>
-        <w:t xml:space="preserve">Restrict to the six GoC states and keep only establishments inside the inland 10 km coastal buffer.</w:t>
-      </w:r>
-    </w:p>
-    <w:p>
-      <w:pPr>
-        <w:numPr>
-          <w:ilvl w:val="0"/>
-          <w:numId w:val="1009"/>
-        </w:numPr>
-        <w:pStyle w:val="Compact"/>
-      </w:pPr>
-      <w:r>
-        <w:t xml:space="preserve">Curate to cultural economic units with a meaningful coastal connection (see dropdown above for what is included and excluded).</w:t>
+        <w:t xml:space="preserve">Limit to cultural economic units with a meaningful coastal connection (see list above for what is included and excluded).</w:t>
       </w:r>
     </w:p>
     <w:p>
@@ -3246,7 +3315,7 @@
         <w:t xml:space="preserve"> </w:t>
       </w:r>
       <w:r>
-        <w:t xml:space="preserve">(updated DENUE prep for the inland 10 km coastal buffer). We show 2026 here on purpose so the group can see recent direction of change for this subcomponent.</w:t>
+        <w:t xml:space="preserve">(updated DENUE prep for the inland 10 km coastal buffer). We show 2026 here on purpose, so the group can see recent direction of change for this subcomponent.</w:t>
       </w:r>
       <w:r>
         <w:t xml:space="preserve"> </w:t>
@@ -3259,7 +3328,7 @@
         <w:t xml:space="preserve">2026 is not yet included in overall CCE or SP</w:t>
       </w:r>
       <w:r>
-        <w:t xml:space="preserve">, because Ama tu Playa adoption inventory is not yet a reliable 2026 observation (see the note under overall scores).</w:t>
+        <w:t xml:space="preserve">, because Ama tu Playa adoption inventory is not yet a reliable 2026 observation (see the note under overall scores). Note that we are able to include 2026 because we use the release of the economic unit inventory released yearly, as a snapshot to represent the annual economic units and number of employees.</w:t>
       </w:r>
     </w:p>
     <w:p>
@@ -3299,7 +3368,7 @@
         <w:t xml:space="preserve"> </w:t>
       </w:r>
       <w:r>
-        <w:t xml:space="preserve">community cultural capacity grew. DENUE records shifted from about one small art studio (roughly 0-5 employees) toward</w:t>
+        <w:t xml:space="preserve">community cultural capacity grew. DENUE records shifted from only one small art studio (roughly 0-5 employees) toward</w:t>
       </w:r>
       <w:r>
         <w:t xml:space="preserve"> </w:t>
@@ -3338,7 +3407,7 @@
           <w:bCs/>
           <w:b/>
         </w:rPr>
-        <w:t xml:space="preserve">3 to about 40</w:t>
+        <w:t xml:space="preserve">3 to about 20</w:t>
       </w:r>
       <w:r>
         <w:t xml:space="preserve">.</w:t>
@@ -3392,7 +3461,7 @@
         <w:t xml:space="preserve">Museo Comunitario de Mulegé</w:t>
       </w:r>
       <w:r>
-        <w:t xml:space="preserve">), but</w:t>
+        <w:t xml:space="preserve">), but estimated employment grew from about</w:t>
       </w:r>
       <w:r>
         <w:t xml:space="preserve"> </w:t>
@@ -3402,29 +3471,54 @@
           <w:bCs/>
           <w:b/>
         </w:rPr>
-        <w:t xml:space="preserve">estimated employment grew</w:t>
-      </w:r>
-      <w:r>
-        <w:t xml:space="preserve"> </w:t>
-      </w:r>
-      <w:r>
-        <w:t xml:space="preserve">from about</w:t>
-      </w:r>
-      <w:r>
-        <w:t xml:space="preserve"> </w:t>
-      </w:r>
+        <w:t xml:space="preserve">30 to about 50</w:t>
+      </w:r>
+      <w:r>
+        <w:t xml:space="preserve"> </w:t>
+      </w:r>
+      <w:r>
+        <w:t xml:space="preserve">staff. More staff is a signal of more activity at existing community cultural places, not only of new sites opening.</w:t>
+      </w:r>
+    </w:p>
+    <w:p>
+      <w:pPr>
+        <w:pStyle w:val="FirstParagraph"/>
+      </w:pPr>
+      <w:r>
+        <w:t xml:space="preserve">Both cases suggest that recent score movement can reflect real growth in coastal cultural infrastructure and jobs.</w:t>
+      </w:r>
+    </w:p>
+    <w:p>
+      <w:pPr>
+        <w:pStyle w:val="BodyText"/>
+      </w:pPr>
       <w:r>
         <w:rPr>
           <w:bCs/>
           <w:b/>
         </w:rPr>
-        <w:t xml:space="preserve">30 to about 50</w:t>
-      </w:r>
-      <w:r>
-        <w:t xml:space="preserve"> </w:t>
-      </w:r>
-      <w:r>
-        <w:t xml:space="preserve">staff. More staff is a signal of more activity at existing community cultural places, not only of new sites opening.</w:t>
+        <w:t xml:space="preserve">Data sources</w:t>
+      </w:r>
+    </w:p>
+    <w:p>
+      <w:pPr>
+        <w:numPr>
+          <w:ilvl w:val="0"/>
+          <w:numId w:val="1012"/>
+        </w:numPr>
+        <w:pStyle w:val="Compact"/>
+      </w:pPr>
+      <w:r>
+        <w:t xml:space="preserve">INEGI DENUE sector 71 cultural and recreation establishments within the inland 10 km coastal buffer; employees estimated from DENUE size classes, scaled to coastal locality population, referenced to the 75th quantile; series through 2026</w:t>
+      </w:r>
+    </w:p>
+    <w:bookmarkStart w:id="59" w:name="X24aa8cc7a592263575ffad37f70c7d6f1f2af4c"/>
+    <w:p>
+      <w:pPr>
+        <w:pStyle w:val="Heading3"/>
+      </w:pPr>
+      <w:r>
+        <w:t xml:space="preserve">4.2.1 Why we use the 75th quantile (compared with the 90th)</w:t>
       </w:r>
     </w:p>
     <w:p>
@@ -3432,48 +3526,23 @@
         <w:pStyle w:val="FirstParagraph"/>
       </w:pPr>
       <w:r>
-        <w:t xml:space="preserve">Both cases suggest that recent score movement can reflect real growth in coastal cultural infrastructure and jobs, not only year-to-year noise in DENUE.</w:t>
-      </w:r>
-    </w:p>
-    <w:p>
-      <w:pPr>
-        <w:pStyle w:val="BodyText"/>
-      </w:pPr>
+        <w:t xml:space="preserve">Before converting to a current status score, the raw rates of employees per coastal resident already show that the</w:t>
+      </w:r>
+      <w:r>
+        <w:t xml:space="preserve"> </w:t>
+      </w:r>
       <w:r>
         <w:rPr>
           <w:bCs/>
           <w:b/>
         </w:rPr>
-        <w:t xml:space="preserve">Data sources</w:t>
-      </w:r>
-    </w:p>
-    <w:p>
-      <w:pPr>
-        <w:numPr>
-          <w:ilvl w:val="0"/>
-          <w:numId w:val="1012"/>
-        </w:numPr>
-        <w:pStyle w:val="Compact"/>
-      </w:pPr>
-      <w:r>
-        <w:t xml:space="preserve">INEGI DENUE sector 71 cultural and recreation establishments within the inland 10 km coastal buffer; employees estimated from DENUE size classes, scaled to coastal locality population, referenced to the 75th quantile; series through 2026</w:t>
-      </w:r>
-    </w:p>
-    <w:bookmarkStart w:id="56" w:name="X24aa8cc7a592263575ffad37f70c7d6f1f2af4c"/>
-    <w:p>
-      <w:pPr>
-        <w:pStyle w:val="Heading3"/>
-      </w:pPr>
-      <w:r>
-        <w:t xml:space="preserve">4.2.1 Why we use the 75th quantile (compared with the 90th)</w:t>
-      </w:r>
-    </w:p>
-    <w:p>
-      <w:pPr>
-        <w:pStyle w:val="FirstParagraph"/>
-      </w:pPr>
-      <w:r>
-        <w:t xml:space="preserve">Before converting to a current status score, the raw rates of employees per coastal resident already show that the</w:t>
+        <w:t xml:space="preserve">Western Midriff Islands (Region 2)</w:t>
+      </w:r>
+      <w:r>
+        <w:t xml:space="preserve"> </w:t>
+      </w:r>
+      <w:r>
+        <w:t xml:space="preserve">sit far above the other regions. Using a high reference like the 90th quantile would make that outlier dominate the benchmark and pull most other regions toward very low scores. We therefore use the</w:t>
       </w:r>
       <w:r>
         <w:t xml:space="preserve"> </w:t>
@@ -3483,23 +3552,7 @@
           <w:bCs/>
           <w:b/>
         </w:rPr>
-        <w:t xml:space="preserve">Western Midriff Islands (Region 2)</w:t>
-      </w:r>
-      <w:r>
-        <w:t xml:space="preserve"> </w:t>
-      </w:r>
-      <w:r>
-        <w:t xml:space="preserve">sit far above the other regions. Using a high reference like the 90th quantile would make that outlier dominate the benchmark and pull most other regions toward very low scores. We therefore use the</w:t>
-      </w:r>
-      <w:r>
-        <w:t xml:space="preserve"> </w:t>
-      </w:r>
-      <w:r>
-        <w:rPr>
-          <w:bCs/>
-          <w:b/>
-        </w:rPr>
-        <w:t xml:space="preserve">75th quartile</w:t>
+        <w:t xml:space="preserve">75th quantile</w:t>
       </w:r>
       <w:r>
         <w:t xml:space="preserve"> </w:t>
@@ -3513,7 +3566,7 @@
         <w:pStyle w:val="BodyText"/>
       </w:pPr>
       <w:r>
-        <w:t xml:space="preserve">The plot below shows the raw rate (not yet scaled to 0-100). Horizontal lines mark the 75th and 90th quantiles across all region-year observations so you can see why the 75th is the more balanced choice for this Gulf data.</w:t>
+        <w:t xml:space="preserve">The plot below shows the raw rate (not yet scaled to 0-100). Horizontal lines mark the pooled 75th and 90th quantiles across all region-year observations so you can see why the 75th is the more balanced choice for this Gulf data.</w:t>
       </w:r>
     </w:p>
     <w:p>
@@ -3525,75 +3578,12 @@
           <wp:inline>
             <wp:extent cx="5334000" cy="5334000"/>
             <wp:effectExtent b="0" l="0" r="0" t="0"/>
-            <wp:docPr descr="Figure 6. Raw non-natural cultural places rate used before conversion to a 0-100 status score. We estimate cultural-establishment employees from INEGI DENUE size classes for curated sector 71 workplaces that sit inside a 10 km inland coastal buffer, then divide by coastal locality population in the same buffer. The green dashed line is the pooled 75th quartile of this rate across all region-years (our chosen reference). The red dotted line is the 90th quantile. Region 2 (Western Midriff Islands) sits far above the others; the 75th quantile still rewards high density while being less dominated by that single outlier than a 90th-quantile reference would be." title="" id="51" name="Picture"/>
+            <wp:docPr descr="Figure 6. Raw non-natural cultural places rate used before conversion to a 0-100 status score. We estimate cultural-establishment employees from INEGI DENUE size classes for curated sector 71 workplaces that sit inside a 10 km inland coastal buffer, then divide by coastal locality population in the same buffer. The green dashed line is the pooled 75th quantile of this rate across all region-years (our chosen reference). The red dotted line is the 90th quantile. Region 2 (Western Midriff Islands) sits far above the others; the 75th quantile still rewards high density while being less dominated by that single outlier than a 90th-quantile reference would be." title="" id="54" name="Picture"/>
             <a:graphic>
               <a:graphicData uri="http://schemas.openxmlformats.org/drawingml/2006/picture">
                 <pic:pic>
                   <pic:nvPicPr>
-                    <pic:cNvPr descr="ewg32_sp_docx_files/figure-docx/unnamed-chunk-8-1.png" id="52" name="Picture"/>
-                    <pic:cNvPicPr>
-                      <a:picLocks noChangeArrowheads="1" noChangeAspect="1"/>
-                    </pic:cNvPicPr>
-                  </pic:nvPicPr>
-                  <pic:blipFill>
-                    <a:blip r:embed="rId50"/>
-                    <a:stretch>
-                      <a:fillRect/>
-                    </a:stretch>
-                  </pic:blipFill>
-                  <pic:spPr bwMode="auto">
-                    <a:xfrm>
-                      <a:off x="0" y="0"/>
-                      <a:ext cx="5334000" cy="5334000"/>
-                    </a:xfrm>
-                    <a:prstGeom prst="rect">
-                      <a:avLst/>
-                    </a:prstGeom>
-                    <a:noFill/>
-                    <a:ln w="9525">
-                      <a:noFill/>
-                      <a:headEnd/>
-                      <a:tailEnd/>
-                    </a:ln>
-                  </pic:spPr>
-                </pic:pic>
-              </a:graphicData>
-            </a:graphic>
-          </wp:inline>
-        </w:drawing>
-      </w:r>
-    </w:p>
-    <w:p>
-      <w:pPr>
-        <w:pStyle w:val="ImageCaption"/>
-      </w:pPr>
-      <w:r>
-        <w:t xml:space="preserve">Figure 6. Raw non-natural cultural places rate used before conversion to a 0-100 status score. We estimate cultural-establishment employees from INEGI DENUE size classes for curated sector 71 workplaces that sit inside a 10 km inland coastal buffer, then divide by coastal locality population in the same buffer. The green dashed line is the pooled 75th quartile of this rate across all region-years (our chosen reference). The red dotted line is the 90th quantile. Region 2 (Western Midriff Islands) sits far above the others; the 75th quantile still rewards high density while being less dominated by that single outlier than a 90th-quantile reference would be.</w:t>
-      </w:r>
-    </w:p>
-    <w:p>
-      <w:pPr>
-        <w:pStyle w:val="BodyText"/>
-      </w:pPr>
-      <w:r>
-        <w:t xml:space="preserve">The 75th quantile is our chosen reference for this assessment cycle.</w:t>
-      </w:r>
-    </w:p>
-    <w:p>
-      <w:pPr>
-        <w:pStyle w:val="CaptionedFigure"/>
-      </w:pPr>
-      <w:r>
-        <w:drawing>
-          <wp:inline>
-            <wp:extent cx="5334000" cy="5334000"/>
-            <wp:effectExtent b="0" l="0" r="0" t="0"/>
-            <wp:docPr descr="Figure 7. Non-natural cultural places status after scaling the Figure 6 rate to the 75th quantile reference and capping at 100. A region at the 75th quartile of employees per coastal resident scores 100; regions with lower rates score proportionally lower. This series shows 2019 through 2026 so experts can see recent DENUE-based change, but 2026 is not yet included in overall CCE or SP because beach-adoption inventory for 2026 is not yet reliable." title="" id="54" name="Picture"/>
-            <a:graphic>
-              <a:graphicData uri="http://schemas.openxmlformats.org/drawingml/2006/picture">
-                <pic:pic>
-                  <pic:nvPicPr>
-                    <pic:cNvPr descr="ewg32_sp_docx_files/figure-docx/unnamed-chunk-9-1.png" id="55" name="Picture"/>
+                    <pic:cNvPr descr="ewg32_sp_docx_files/figure-docx/unnamed-chunk-8-1.png" id="55" name="Picture"/>
                     <pic:cNvPicPr>
                       <a:picLocks noChangeArrowheads="1" noChangeAspect="1"/>
                     </pic:cNvPicPr>
@@ -3631,7 +3621,70 @@
         <w:pStyle w:val="ImageCaption"/>
       </w:pPr>
       <w:r>
-        <w:t xml:space="preserve">Figure 7. Non-natural cultural places status after scaling the Figure 6 rate to the 75th quantile reference and capping at 100. A region at the 75th quartile of employees per coastal resident scores 100; regions with lower rates score proportionally lower. This series shows 2019 through 2026 so experts can see recent DENUE-based change, but 2026 is not yet included in overall CCE or SP because beach-adoption inventory for 2026 is not yet reliable.</w:t>
+        <w:t xml:space="preserve">Figure 6. Raw non-natural cultural places rate used before conversion to a 0-100 status score. We estimate cultural-establishment employees from INEGI DENUE size classes for curated sector 71 workplaces that sit inside a 10 km inland coastal buffer, then divide by coastal locality population in the same buffer. The green dashed line is the pooled 75th quantile of this rate across all region-years (our chosen reference). The red dotted line is the 90th quantile. Region 2 (Western Midriff Islands) sits far above the others; the 75th quantile still rewards high density while being less dominated by that single outlier than a 90th-quantile reference would be.</w:t>
+      </w:r>
+    </w:p>
+    <w:p>
+      <w:pPr>
+        <w:pStyle w:val="BodyText"/>
+      </w:pPr>
+      <w:r>
+        <w:t xml:space="preserve">The 75th quantile is our chosen reference for this assessment cycle.</w:t>
+      </w:r>
+    </w:p>
+    <w:p>
+      <w:pPr>
+        <w:pStyle w:val="CaptionedFigure"/>
+      </w:pPr>
+      <w:r>
+        <w:drawing>
+          <wp:inline>
+            <wp:extent cx="5334000" cy="5334000"/>
+            <wp:effectExtent b="0" l="0" r="0" t="0"/>
+            <wp:docPr descr="Figure 7. Non-natural cultural places status after scaling the Figure 6 rate to the 75th quantile reference and capping at 100. A region at the 75th quantile of employees per coastal resident scores 100; regions with lower rates score proportionally lower. This series shows 2019 through 2026 so experts can see recent DENUE-based change, but 2026 is not yet included in overall CCE or SP because beach-adoption inventory for 2026 is not yet reliable." title="" id="57" name="Picture"/>
+            <a:graphic>
+              <a:graphicData uri="http://schemas.openxmlformats.org/drawingml/2006/picture">
+                <pic:pic>
+                  <pic:nvPicPr>
+                    <pic:cNvPr descr="ewg32_sp_docx_files/figure-docx/unnamed-chunk-9-1.png" id="58" name="Picture"/>
+                    <pic:cNvPicPr>
+                      <a:picLocks noChangeArrowheads="1" noChangeAspect="1"/>
+                    </pic:cNvPicPr>
+                  </pic:nvPicPr>
+                  <pic:blipFill>
+                    <a:blip r:embed="rId56"/>
+                    <a:stretch>
+                      <a:fillRect/>
+                    </a:stretch>
+                  </pic:blipFill>
+                  <pic:spPr bwMode="auto">
+                    <a:xfrm>
+                      <a:off x="0" y="0"/>
+                      <a:ext cx="5334000" cy="5334000"/>
+                    </a:xfrm>
+                    <a:prstGeom prst="rect">
+                      <a:avLst/>
+                    </a:prstGeom>
+                    <a:noFill/>
+                    <a:ln w="9525">
+                      <a:noFill/>
+                      <a:headEnd/>
+                      <a:tailEnd/>
+                    </a:ln>
+                  </pic:spPr>
+                </pic:pic>
+              </a:graphicData>
+            </a:graphic>
+          </wp:inline>
+        </w:drawing>
+      </w:r>
+    </w:p>
+    <w:p>
+      <w:pPr>
+        <w:pStyle w:val="ImageCaption"/>
+      </w:pPr>
+      <w:r>
+        <w:t xml:space="preserve">Figure 7. Non-natural cultural places status after scaling the Figure 6 rate to the 75th quantile reference and capping at 100. A region at the 75th quantile of employees per coastal resident scores 100; regions with lower rates score proportionally lower. This series shows 2019 through 2026 so experts can see recent DENUE-based change, but 2026 is not yet included in overall CCE or SP because beach-adoption inventory for 2026 is not yet reliable.</w:t>
       </w:r>
     </w:p>
     <w:p>
@@ -3641,10 +3694,10 @@
         </w:pict>
       </w:r>
     </w:p>
-    <w:bookmarkEnd w:id="56"/>
-    <w:bookmarkEnd w:id="57"/>
-    <w:bookmarkEnd w:id="58"/>
-    <w:bookmarkStart w:id="63" w:name="looking-forward-pueblos"/>
+    <w:bookmarkEnd w:id="59"/>
+    <w:bookmarkEnd w:id="60"/>
+    <w:bookmarkEnd w:id="61"/>
+    <w:bookmarkStart w:id="66" w:name="looking-forward-pueblos"/>
     <w:p>
       <w:pPr>
         <w:pStyle w:val="Heading1"/>
@@ -3653,7 +3706,7 @@
         <w:t xml:space="preserve">5. Acknowledgment: Pueblos originarios</w:t>
       </w:r>
     </w:p>
-    <w:bookmarkStart w:id="59" w:name="why-this-section-exists"/>
+    <w:bookmarkStart w:id="62" w:name="why-this-section-exists"/>
     <w:p>
       <w:pPr>
         <w:pStyle w:val="Heading2"/>
@@ -3686,8 +3739,8 @@
         <w:t xml:space="preserve">At the same time, Indigenous peoples are not a single box. They are also coastal residents, fishers, knowledge holders, and neighbors within the same seascapes that the Index tries to describe. We do not want to isolate them from the Index, and we also do not want to impose an outside framework for assessing the condition of their connection to the ocean.</w:t>
       </w:r>
     </w:p>
-    <w:bookmarkEnd w:id="59"/>
-    <w:bookmarkStart w:id="60" w:name="what-we-considered-for-cce"/>
+    <w:bookmarkEnd w:id="62"/>
+    <w:bookmarkStart w:id="63" w:name="what-we-considered-for-cce"/>
     <w:p>
       <w:pPr>
         <w:pStyle w:val="Heading2"/>
@@ -3775,8 +3828,8 @@
         <w:t xml:space="preserve">It was also proposed to frame the metric around two practical questions: (1) is the community recognized by the government, and (2) do they have funding support and centers?</w:t>
       </w:r>
     </w:p>
-    <w:bookmarkEnd w:id="60"/>
-    <w:bookmarkStart w:id="61" w:name="X2b37dfd54cfe88a6705d26d079125455031cbf8"/>
+    <w:bookmarkEnd w:id="63"/>
+    <w:bookmarkStart w:id="64" w:name="X2b37dfd54cfe88a6705d26d079125455031cbf8"/>
     <w:p>
       <w:pPr>
         <w:pStyle w:val="Heading2"/>
@@ -3898,8 +3951,8 @@
         <w:t xml:space="preserve">: ideas that would ideally be incorporated in the next time the assessment is run, but currently are not indicators we are ready to score as if they represent community values.</w:t>
       </w:r>
     </w:p>
-    <w:bookmarkEnd w:id="61"/>
-    <w:bookmarkStart w:id="62" w:name="looking-forward"/>
+    <w:bookmarkEnd w:id="64"/>
+    <w:bookmarkStart w:id="65" w:name="looking-forward"/>
     <w:p>
       <w:pPr>
         <w:pStyle w:val="Heading2"/>
@@ -3931,9 +3984,9 @@
         </w:pict>
       </w:r>
     </w:p>
-    <w:bookmarkEnd w:id="62"/>
-    <w:bookmarkEnd w:id="63"/>
-    <w:bookmarkStart w:id="135" w:name="lasting-special-places-lsp"/>
+    <w:bookmarkEnd w:id="65"/>
+    <w:bookmarkEnd w:id="66"/>
+    <w:bookmarkStart w:id="139" w:name="lasting-special-places-lsp"/>
     <w:p>
       <w:pPr>
         <w:pStyle w:val="Heading1"/>
@@ -3950,7 +4003,7 @@
         <w:t xml:space="preserve">LSP measures how well we are protecting places that the Expert Working Group identified as lasting special places for ecological, cultural, recreational, spiritual, or aesthetic reasons.</w:t>
       </w:r>
     </w:p>
-    <w:bookmarkStart w:id="67" w:name="how-lsp-was-built"/>
+    <w:bookmarkStart w:id="70" w:name="how-lsp-was-built"/>
     <w:p>
       <w:pPr>
         <w:pStyle w:val="Heading2"/>
@@ -4234,7 +4287,7 @@
         <w:t xml:space="preserve"> </w:t>
       </w:r>
       <w:r>
-        <w:t xml:space="preserve">by OHI marine region (static export from LSP prep visualization on Mazu). Colors run from lower scores (warmer colors) to higher scores (cooler colors) on a fixed 0 to 100 scale. White regions have no combined score.</w:t>
+        <w:t xml:space="preserve">by OHI marine region (static export from LSP prep visualization on Mazu). Colors run from lower scores (warmer colors) to higher scores (cooler colors) on a fixed 0 to 100 scale. White regions have no combined score, and are NA.</w:t>
       </w:r>
     </w:p>
     <w:p>
@@ -4246,18 +4299,18 @@
           <wp:inline>
             <wp:extent cx="4800600" cy="4800600"/>
             <wp:effectExtent b="0" l="0" r="0" t="0"/>
-            <wp:docPr descr="Figure 8. Overall Lasting Special Places (LSP) current status by OHI marine region for the 2025 assessment snapshot. LSP is the mean condition of expert-identified special places once each place has been scored from management and legal protections. Colors run from lower scores (warmer) to higher scores (cooler) on a fixed 0-100 scale. White means that region has no combined LSP score for this year." title="" id="65" name="Picture"/>
+            <wp:docPr descr="Figure 8. Overall Lasting Special Places (LSP) current status by OHI marine region for the 2025 assessment snapshot. LSP is the mean condition of expert-identified special places once each place has been scored from management and legal protections. Colors run from lower scores (warmer) to higher scores (cooler) on a fixed 0 to 100 scale. White means that region has no combined LSP score for this year." title="" id="68" name="Picture"/>
             <a:graphic>
               <a:graphicData uri="http://schemas.openxmlformats.org/drawingml/2006/picture">
                 <pic:pic>
                   <pic:nvPicPr>
-                    <pic:cNvPr descr="../images/sp_lsp_figs/lsp_overall_2025.png" id="66" name="Picture"/>
+                    <pic:cNvPr descr="../images/sp_lsp_figs/lsp_overall_2025.png" id="69" name="Picture"/>
                     <pic:cNvPicPr>
                       <a:picLocks noChangeArrowheads="1" noChangeAspect="1"/>
                     </pic:cNvPicPr>
                   </pic:nvPicPr>
                   <pic:blipFill>
-                    <a:blip r:embed="rId64"/>
+                    <a:blip r:embed="rId67"/>
                     <a:stretch>
                       <a:fillRect/>
                     </a:stretch>
@@ -4289,11 +4342,11 @@
         <w:pStyle w:val="ImageCaption"/>
       </w:pPr>
       <w:r>
-        <w:t xml:space="preserve">Figure 8. Overall Lasting Special Places (LSP) current status by OHI marine region for the 2025 assessment snapshot. LSP is the mean condition of expert-identified special places once each place has been scored from management and legal protections. Colors run from lower scores (warmer) to higher scores (cooler) on a fixed 0-100 scale. White means that region has no combined LSP score for this year.</w:t>
-      </w:r>
-    </w:p>
-    <w:bookmarkEnd w:id="67"/>
-    <w:bookmarkStart w:id="74" w:name="spreadsheets-for-expert-review"/>
+        <w:t xml:space="preserve">Figure 8. Overall Lasting Special Places (LSP) current status by OHI marine region for the 2025 assessment snapshot. LSP is the mean condition of expert-identified special places once each place has been scored from management and legal protections. Colors run from lower scores (warmer) to higher scores (cooler) on a fixed 0 to 100 scale. White means that region has no combined LSP score for this year.</w:t>
+      </w:r>
+    </w:p>
+    <w:bookmarkEnd w:id="70"/>
+    <w:bookmarkStart w:id="77" w:name="spreadsheets-for-expert-review"/>
     <w:p>
       <w:pPr>
         <w:pStyle w:val="Heading2"/>
@@ -4318,7 +4371,7 @@
         </w:numPr>
         <w:pStyle w:val="Compact"/>
       </w:pPr>
-      <w:hyperlink r:id="rId68">
+      <w:hyperlink r:id="rId71">
         <w:r>
           <w:rPr>
             <w:rStyle w:val="Hyperlink"/>
@@ -4335,7 +4388,7 @@
         </w:numPr>
         <w:pStyle w:val="Compact"/>
       </w:pPr>
-      <w:hyperlink r:id="rId69">
+      <w:hyperlink r:id="rId72">
         <w:r>
           <w:rPr>
             <w:rStyle w:val="Hyperlink"/>
@@ -4352,7 +4405,7 @@
         </w:numPr>
         <w:pStyle w:val="Compact"/>
       </w:pPr>
-      <w:hyperlink r:id="rId70">
+      <w:hyperlink r:id="rId73">
         <w:r>
           <w:rPr>
             <w:rStyle w:val="Hyperlink"/>
@@ -4369,7 +4422,7 @@
         </w:numPr>
         <w:pStyle w:val="Compact"/>
       </w:pPr>
-      <w:hyperlink r:id="rId71">
+      <w:hyperlink r:id="rId74">
         <w:r>
           <w:rPr>
             <w:rStyle w:val="Hyperlink"/>
@@ -4386,7 +4439,7 @@
         </w:numPr>
         <w:pStyle w:val="Compact"/>
       </w:pPr>
-      <w:hyperlink r:id="rId72">
+      <w:hyperlink r:id="rId75">
         <w:r>
           <w:rPr>
             <w:rStyle w:val="Hyperlink"/>
@@ -4403,7 +4456,7 @@
         </w:numPr>
         <w:pStyle w:val="Compact"/>
       </w:pPr>
-      <w:hyperlink r:id="rId73">
+      <w:hyperlink r:id="rId76">
         <w:r>
           <w:rPr>
             <w:rStyle w:val="Hyperlink"/>
@@ -4412,8 +4465,8 @@
         </w:r>
       </w:hyperlink>
     </w:p>
-    <w:bookmarkEnd w:id="74"/>
-    <w:bookmarkStart w:id="134" w:name="condition-approach-by-lsp-category"/>
+    <w:bookmarkEnd w:id="77"/>
+    <w:bookmarkStart w:id="138" w:name="condition-approach-by-lsp-category"/>
     <w:p>
       <w:pPr>
         <w:pStyle w:val="Heading2"/>
@@ -4482,7 +4535,7 @@
         <w:t xml:space="preserve">A multi-panel of all category scores is also at the end of this section.</w:t>
       </w:r>
     </w:p>
-    <w:bookmarkStart w:id="82" w:name="special-protected-areas"/>
+    <w:bookmarkStart w:id="85" w:name="special-protected-areas"/>
     <w:p>
       <w:pPr>
         <w:pStyle w:val="Heading3"/>
@@ -4512,7 +4565,7 @@
         <w:t xml:space="preserve"> </w:t>
       </w:r>
       <w:r>
-        <w:t xml:space="preserve">the full set of every park boundary in the Gulf. Experts selected places that matter as lasting special places for communities and nature, rather than areas that may exist on paper mainly from political design processes without that place-based meaning.</w:t>
+        <w:t xml:space="preserve">the full set of every protected area boundary in the Gulf. Experts selected places that matter as lasting special places for communities and nature, rather than areas that may exist on paper mainly from political design processes without that place-based meaning.</w:t>
       </w:r>
     </w:p>
     <w:p>
@@ -4595,7 +4648,7 @@
       <w:r>
         <w:t xml:space="preserve"> </w:t>
       </w:r>
-      <w:hyperlink r:id="rId75">
+      <w:hyperlink r:id="rId78">
         <w:r>
           <w:rPr>
             <w:rStyle w:val="Hyperlink"/>
@@ -4702,18 +4755,18 @@
           <wp:inline>
             <wp:extent cx="4533900" cy="4533900"/>
             <wp:effectExtent b="0" l="0" r="0" t="0"/>
-            <wp:docPr descr="Figure 9. Method map for special protected areas within Lasting Special Places. Experts listed CONANP natural protected areas and Ramsar wetland sites that they consider ecologically special. Each filled polygon is colored by the condition score we assign that site. Preference goes to CONANP SIMEC i-efectividad when available: SIMEC is CONANP’s Sistema de Informacion, Monitoreo y Evaluacion para la Conservacion, and i-efectividad is its management-effectiveness score. In plain terms, it asks how well a protected area is being managed to achieve its conservation goals, not simply whether the special place is located within a protected area. For Ramsar sites without a parallel SIMEC score we use management-plan presence (plan exists, plan in progress scoring 60, or no plan). Grey outlines show the broader Gulf protected-area network for spatial context, including areas that are protected but were not listed as special by the Expert Working Group." title="" id="77" name="Picture"/>
+            <wp:docPr descr="Figure 9. Method map for special protected areas within Lasting Special Places. Experts listed CONANP natural protected areas and Ramsar wetland sites that they consider ecologically special. Each filled polygon is colored by the condition score we assign that site. Preference goes to CONANP SIMEC i-efectividad when available: SIMEC is CONANP’s Sistema de Informacion, Monitoreo y Evaluacion para la Conservacion, and i-efectividad is its management-effectiveness score. In plain terms, it asks how well a protected area is being managed to achieve its conservation goals, not simply whether the special place is located within a protected area. For Ramsar sites without a parallel SIMEC score we use management-plan presence (plan exists, plan in progress scoring 60, or no plan). Grey outlines show the broader Gulf protected-area network for spatial context, including areas that are protected but were not listed as special by the Expert Working Group." title="" id="80" name="Picture"/>
             <a:graphic>
               <a:graphicData uri="http://schemas.openxmlformats.org/drawingml/2006/picture">
                 <pic:pic>
                   <pic:nvPicPr>
-                    <pic:cNvPr descr="../images/sp_lsp_figs/process_special_protected_areas.png" id="78" name="Picture"/>
+                    <pic:cNvPr descr="../images/sp_lsp_figs/process_special_protected_areas.png" id="81" name="Picture"/>
                     <pic:cNvPicPr>
                       <a:picLocks noChangeArrowheads="1" noChangeAspect="1"/>
                     </pic:cNvPicPr>
                   </pic:nvPicPr>
                   <pic:blipFill>
-                    <a:blip r:embed="rId76"/>
+                    <a:blip r:embed="rId79"/>
                     <a:stretch>
                       <a:fillRect/>
                     </a:stretch>
@@ -4757,18 +4810,18 @@
           <wp:inline>
             <wp:extent cx="4000500" cy="4000499"/>
             <wp:effectExtent b="0" l="0" r="0" t="0"/>
-            <wp:docPr descr="Figure 10. Regional scores for the special protected areas category. Within each OHI region we average the condition scores of the expert-listed special parks and Ramsar sites that fall in that region after the SIMEC and Ramsar plan rules in Figure 9. Scores sit on a 0-100 scale. White or missing means no scored special protected area contributes in that region for this assessment." title="" id="80" name="Picture"/>
+            <wp:docPr descr="Figure 10. Regional scores for the special protected areas category. Within each OHI region we average the condition scores of the expert-listed special protected areas and Ramsar sites that fall in that region after the SIMEC i-efectividad and Ramsar plan rules in Figure 9. Scores sit on a 0 to 100 scale. White or missing means no scored special protected area contributes in that region for this assessment." title="" id="83" name="Picture"/>
             <a:graphic>
               <a:graphicData uri="http://schemas.openxmlformats.org/drawingml/2006/picture">
                 <pic:pic>
                   <pic:nvPicPr>
-                    <pic:cNvPr descr="../images/sp_lsp_figs/lsp_special_protected_areas.png" id="81" name="Picture"/>
+                    <pic:cNvPr descr="../images/sp_lsp_figs/lsp_special_protected_areas.png" id="84" name="Picture"/>
                     <pic:cNvPicPr>
                       <a:picLocks noChangeArrowheads="1" noChangeAspect="1"/>
                     </pic:cNvPicPr>
                   </pic:nvPicPr>
                   <pic:blipFill>
-                    <a:blip r:embed="rId79"/>
+                    <a:blip r:embed="rId82"/>
                     <a:stretch>
                       <a:fillRect/>
                     </a:stretch>
@@ -4800,7 +4853,7 @@
         <w:pStyle w:val="ImageCaption"/>
       </w:pPr>
       <w:r>
-        <w:t xml:space="preserve">Figure 10. Regional scores for the special protected areas category. Within each OHI region we average the condition scores of the expert-listed special parks and Ramsar sites that fall in that region after the SIMEC and Ramsar plan rules in Figure 9. Scores sit on a 0-100 scale. White or missing means no scored special protected area contributes in that region for this assessment.</w:t>
+        <w:t xml:space="preserve">Figure 10. Regional scores for the special protected areas category. Within each OHI region we average the condition scores of the expert-listed special protected areas and Ramsar sites that fall in that region after the SIMEC i-efectividad and Ramsar plan rules in Figure 9. Scores sit on a 0 to 100 scale. White or missing means no scored special protected area contributes in that region for this assessment.</w:t>
       </w:r>
     </w:p>
     <w:p>
@@ -4826,7 +4879,7 @@
       <w:r>
         <w:t xml:space="preserve">Expert Working Group special protected area list (</w:t>
       </w:r>
-      <w:hyperlink r:id="rId68">
+      <w:hyperlink r:id="rId71">
         <w:r>
           <w:rPr>
             <w:rStyle w:val="Hyperlink"/>
@@ -4849,7 +4902,7 @@
       <w:r>
         <w:t xml:space="preserve">CONANP SIMEC i-efectividad (</w:t>
       </w:r>
-      <w:hyperlink r:id="rId69">
+      <w:hyperlink r:id="rId72">
         <w:r>
           <w:rPr>
             <w:rStyle w:val="Hyperlink"/>
@@ -4863,7 +4916,7 @@
       <w:r>
         <w:t xml:space="preserve"> </w:t>
       </w:r>
-      <w:hyperlink r:id="rId75">
+      <w:hyperlink r:id="rId78">
         <w:r>
           <w:rPr>
             <w:rStyle w:val="Hyperlink"/>
@@ -4886,7 +4939,7 @@
       <w:r>
         <w:t xml:space="preserve">Ramsar management plan presence (</w:t>
       </w:r>
-      <w:hyperlink r:id="rId71">
+      <w:hyperlink r:id="rId74">
         <w:r>
           <w:rPr>
             <w:rStyle w:val="Hyperlink"/>
@@ -4910,8 +4963,8 @@
         <w:t xml:space="preserve">Combined protected area polygons: WDPA (January 2025), CONANP ANP layers, and HEM ANP compilation</w:t>
       </w:r>
     </w:p>
-    <w:bookmarkEnd w:id="82"/>
-    <w:bookmarkStart w:id="93" w:name="priority-dive-sites"/>
+    <w:bookmarkEnd w:id="85"/>
+    <w:bookmarkStart w:id="97" w:name="priority-dive-sites"/>
     <w:p>
       <w:pPr>
         <w:pStyle w:val="Heading3"/>
@@ -4925,7 +4978,7 @@
         <w:pStyle w:val="FirstParagraph"/>
       </w:pPr>
       <w:r>
-        <w:t xml:space="preserve">These are dive spots identified in Arcos-Aguilar et al. 2021 and the GCMP that would benefit most from protection.</w:t>
+        <w:t xml:space="preserve">These are dive spots from the Arcos-Aguilar et al. (2021) dive-site inventory and the CBMC GCMP prioritization of diving sites that would benefit most from formal protected-area management.</w:t>
       </w:r>
     </w:p>
     <w:p>
@@ -4937,13 +4990,24 @@
           <w:bCs/>
           <w:b/>
         </w:rPr>
-        <w:t xml:space="preserve">Why protected dive sites score higher.</w:t>
-      </w:r>
-      <w:r>
-        <w:t xml:space="preserve"> </w:t>
-      </w:r>
-      <w:r>
-        <w:t xml:space="preserve">Priority dive places are lasting special places because people travel specifically to experience them. Protection helps keep the wildlife, reefs, and underwater features that make the trip meaningful, supports dive-based livelihoods when sites stay high quality, and reduces cumulative damage from use and extractive pressure. Managed parks and no-take cores increase the chance that the site remains the place communities and visitors valued. Outside parks there is still national dive-tourism law (NOM-012-TUR-2016), but that residual duty of care is intentionally weaker than well managed protection, because it is not the same as active park management for a special place.</w:t>
+        <w:t xml:space="preserve">How Arcos-Aguilar et al. (2021) assembled and characterized dive sites.</w:t>
+      </w:r>
+      <w:r>
+        <w:t xml:space="preserve"> </w:t>
+      </w:r>
+      <w:hyperlink r:id="rId86">
+        <w:r>
+          <w:rPr>
+            <w:rStyle w:val="Hyperlink"/>
+          </w:rPr>
+          <w:t xml:space="preserve">Arcos-Aguilar et al. (2021)</w:t>
+        </w:r>
+      </w:hyperlink>
+      <w:r>
+        <w:t xml:space="preserve"> </w:t>
+      </w:r>
+      <w:r>
+        <w:t xml:space="preserve">built the most comprehensive national inventory of recreational dive sites in Mexico to document the economic importance of diving tourism and its dependence on healthy marine habitats. Their method:</w:t>
       </w:r>
     </w:p>
     <w:p>
@@ -4954,41 +5018,411 @@
         </w:numPr>
         <w:pStyle w:val="Compact"/>
       </w:pPr>
-      <w:r>
-        <w:t xml:space="preserve">If the dive site falls in a CONANP and/or Ramsar protected area, use SIMEC and Ramsar plan condition for that area.</w:t>
-      </w:r>
-    </w:p>
-    <w:p>
-      <w:pPr>
-        <w:numPr>
-          <w:ilvl w:val="0"/>
-          <w:numId w:val="1022"/>
-        </w:numPr>
-        <w:pStyle w:val="Compact"/>
-      </w:pPr>
-      <w:r>
-        <w:t xml:space="preserve">If it falls in both, take the maximum of the two condition scores.</w:t>
-      </w:r>
-    </w:p>
-    <w:p>
-      <w:pPr>
-        <w:numPr>
-          <w:ilvl w:val="0"/>
-          <w:numId w:val="1022"/>
-        </w:numPr>
-        <w:pStyle w:val="Compact"/>
-      </w:pPr>
-      <w:r>
-        <w:t xml:space="preserve">If it is outside protected areas, use a non-zero floor from NOM-012-TUR-2016 §6.11 (legal dive tourism rules that apply inside and outside protected natural areas). In prep, that floor is taken as the minimum observed protected-area condition among dive sites that do have a park score (currently</w:t>
-      </w:r>
-      <w:r>
-        <w:t xml:space="preserve"> </w:t>
-      </w:r>
       <w:r>
         <w:rPr>
           <w:bCs/>
           <w:b/>
         </w:rPr>
+        <w:t xml:space="preserve">Web inventory of sites.</w:t>
+      </w:r>
+      <w:r>
+        <w:t xml:space="preserve"> </w:t>
+      </w:r>
+      <w:r>
+        <w:t xml:space="preserve">From January to March 2018 they searched Google in English and Spanish (</w:t>
+      </w:r>
+      <w:r>
+        <w:rPr>
+          <w:rStyle w:val="VerbatimChar"/>
+        </w:rPr>
+        <w:t xml:space="preserve">Diving</w:t>
+      </w:r>
+      <w:r>
+        <w:t xml:space="preserve"> </w:t>
+      </w:r>
+      <w:r>
+        <w:t xml:space="preserve">/</w:t>
+      </w:r>
+      <w:r>
+        <w:t xml:space="preserve"> </w:t>
+      </w:r>
+      <w:r>
+        <w:rPr>
+          <w:rStyle w:val="VerbatimChar"/>
+        </w:rPr>
+        <w:t xml:space="preserve">Dive sites</w:t>
+      </w:r>
+      <w:r>
+        <w:t xml:space="preserve"> </w:t>
+      </w:r>
+      <w:r>
+        <w:t xml:space="preserve">/</w:t>
+      </w:r>
+      <w:r>
+        <w:t xml:space="preserve"> </w:t>
+      </w:r>
+      <w:r>
+        <w:rPr>
+          <w:rStyle w:val="VerbatimChar"/>
+        </w:rPr>
+        <w:t xml:space="preserve">Buceo</w:t>
+      </w:r>
+      <w:r>
+        <w:t xml:space="preserve"> </w:t>
+      </w:r>
+      <w:r>
+        <w:t xml:space="preserve">/</w:t>
+      </w:r>
+      <w:r>
+        <w:t xml:space="preserve"> </w:t>
+      </w:r>
+      <w:r>
+        <w:rPr>
+          <w:rStyle w:val="VerbatimChar"/>
+        </w:rPr>
+        <w:t xml:space="preserve">Sitios de buceo</w:t>
+      </w:r>
+      <w:r>
+        <w:t xml:space="preserve"> </w:t>
+      </w:r>
+      <w:r>
+        <w:t xml:space="preserve">+ Mexico, then each coastal state). They retained results from tourism and diving-operator websites, dive magazines, peer-reviewed papers, and gray literature.</w:t>
+      </w:r>
+    </w:p>
+    <w:p>
+      <w:pPr>
+        <w:numPr>
+          <w:ilvl w:val="0"/>
+          <w:numId w:val="1022"/>
+        </w:numPr>
+        <w:pStyle w:val="Compact"/>
+      </w:pPr>
+      <w:r>
+        <w:rPr>
+          <w:bCs/>
+          <w:b/>
+        </w:rPr>
+        <w:t xml:space="preserve">Popularity proxy.</w:t>
+      </w:r>
+      <w:r>
+        <w:t xml:space="preserve"> </w:t>
+      </w:r>
+      <w:r>
+        <w:t xml:space="preserve">Each time a place reappeared in search results was tallied as a</w:t>
+      </w:r>
+      <w:r>
+        <w:t xml:space="preserve"> </w:t>
+      </w:r>
+      <w:r>
+        <w:t xml:space="preserve">“</w:t>
+      </w:r>
+      <w:r>
+        <w:t xml:space="preserve">frequency of appearance,</w:t>
+      </w:r>
+      <w:r>
+        <w:t xml:space="preserve">”</w:t>
+      </w:r>
+      <w:r>
+        <w:t xml:space="preserve"> </w:t>
+      </w:r>
+      <w:r>
+        <w:t xml:space="preserve">used later as a simple popularity signal (more web mentions ≈ more widely advertised/known).</w:t>
+      </w:r>
+    </w:p>
+    <w:p>
+      <w:pPr>
+        <w:numPr>
+          <w:ilvl w:val="0"/>
+          <w:numId w:val="1022"/>
+        </w:numPr>
+        <w:pStyle w:val="Compact"/>
+      </w:pPr>
+      <w:r>
+        <w:rPr>
+          <w:bCs/>
+          <w:b/>
+        </w:rPr>
+        <w:t xml:space="preserve">Operators and economics.</w:t>
+      </w:r>
+      <w:r>
+        <w:t xml:space="preserve"> </w:t>
+      </w:r>
+      <w:r>
+        <w:t xml:space="preserve">They also assembled and field-checked active diving operators and surveyed a subset about clients, prices, and costs, showing that national diving revenues are on the same order of magnitude as Mexico’s artisanal and industrial fisheries together.</w:t>
+      </w:r>
+    </w:p>
+    <w:p>
+      <w:pPr>
+        <w:numPr>
+          <w:ilvl w:val="0"/>
+          <w:numId w:val="1022"/>
+        </w:numPr>
+        <w:pStyle w:val="Compact"/>
+      </w:pPr>
+      <w:r>
+        <w:rPr>
+          <w:bCs/>
+          <w:b/>
+        </w:rPr>
+        <w:t xml:space="preserve">Protection status overlay.</w:t>
+      </w:r>
+      <w:r>
+        <w:t xml:space="preserve"> </w:t>
+      </w:r>
+      <w:r>
+        <w:t xml:space="preserve">Site coordinates were overlaid on CONANP marine protected-area polygons and no-take sub-zones. Of the inventory, roughly half the sites sat inside some form of natural protected area, a small minority fell inside no-take zones, and a large share (</w:t>
+      </w:r>
+      <w:r>
+        <w:rPr>
+          <w:bCs/>
+          <w:b/>
+        </w:rPr>
+        <w:t xml:space="preserve">about 42%</w:t>
+      </w:r>
+      <w:r>
+        <w:t xml:space="preserve">) still lacked any protection designation.</w:t>
+      </w:r>
+    </w:p>
+    <w:p>
+      <w:pPr>
+        <w:pStyle w:val="FirstParagraph"/>
+      </w:pPr>
+      <w:r>
+        <w:t xml:space="preserve">The paper’s policy message is that many tourism-visible dive places remain outside strong protection even though diving depends on intact reefs and wildlife, and that higher encounter quality (especially in no-take settings) is linked to the experience visitors pay for.</w:t>
+      </w:r>
+    </w:p>
+    <w:p>
+      <w:pPr>
+        <w:pStyle w:val="BodyText"/>
+      </w:pPr>
+      <w:r>
+        <w:rPr>
+          <w:bCs/>
+          <w:b/>
+        </w:rPr>
+        <w:t xml:space="preserve">What</w:t>
+      </w:r>
+      <w:r>
+        <w:rPr>
+          <w:bCs/>
+          <w:b/>
+        </w:rPr>
+        <w:t xml:space="preserve"> </w:t>
+      </w:r>
+      <w:r>
+        <w:rPr>
+          <w:bCs/>
+          <w:b/>
+        </w:rPr>
+        <w:t xml:space="preserve">“</w:t>
+      </w:r>
+      <w:r>
+        <w:rPr>
+          <w:bCs/>
+          <w:b/>
+        </w:rPr>
+        <w:t xml:space="preserve">priority dive sites</w:t>
+      </w:r>
+      <w:r>
+        <w:rPr>
+          <w:bCs/>
+          <w:b/>
+        </w:rPr>
+        <w:t xml:space="preserve">”</w:t>
+      </w:r>
+      <w:r>
+        <w:rPr>
+          <w:bCs/>
+          <w:b/>
+        </w:rPr>
+        <w:t xml:space="preserve"> </w:t>
+      </w:r>
+      <w:r>
+        <w:rPr>
+          <w:bCs/>
+          <w:b/>
+        </w:rPr>
+        <w:t xml:space="preserve">mean in this Index.</w:t>
+      </w:r>
+      <w:r>
+        <w:t xml:space="preserve"> </w:t>
+      </w:r>
+      <w:r>
+        <w:t xml:space="preserve">We do</w:t>
+      </w:r>
+      <w:r>
+        <w:t xml:space="preserve"> </w:t>
+      </w:r>
+      <w:r>
+        <w:rPr>
+          <w:bCs/>
+          <w:b/>
+        </w:rPr>
+        <w:t xml:space="preserve">not</w:t>
+      </w:r>
+      <w:r>
+        <w:t xml:space="preserve"> </w:t>
+      </w:r>
+      <w:r>
+        <w:t xml:space="preserve">score every site from the full national inventory. Instead, we restrict sites to the</w:t>
+      </w:r>
+      <w:r>
+        <w:t xml:space="preserve"> </w:t>
+      </w:r>
+      <w:r>
+        <w:rPr>
+          <w:bCs/>
+          <w:b/>
+        </w:rPr>
+        <w:t xml:space="preserve">CBMC GCMP prioritization of diving sites</w:t>
+      </w:r>
+      <w:r>
+        <w:t xml:space="preserve"> </w:t>
+      </w:r>
+      <w:r>
+        <w:t xml:space="preserve">table that is an Arcos/GCMP data product: a curated subset of sites with coordinates and priority fields that flags diving locations of particular conservation and tourism importance. That priority subset is what we call</w:t>
+      </w:r>
+      <w:r>
+        <w:t xml:space="preserve"> </w:t>
+      </w:r>
+      <w:r>
+        <w:rPr>
+          <w:bCs/>
+          <w:b/>
+        </w:rPr>
+        <w:t xml:space="preserve">priority dive sites</w:t>
+      </w:r>
+      <w:r>
+        <w:t xml:space="preserve"> </w:t>
+      </w:r>
+      <w:r>
+        <w:t xml:space="preserve">here.</w:t>
+      </w:r>
+    </w:p>
+    <w:p>
+      <w:pPr>
+        <w:pStyle w:val="BodyText"/>
+      </w:pPr>
+      <w:r>
+        <w:rPr>
+          <w:bCs/>
+          <w:b/>
+        </w:rPr>
+        <w:t xml:space="preserve">Why we use that subset as lasting special places.</w:t>
+      </w:r>
+      <w:r>
+        <w:t xml:space="preserve"> </w:t>
+      </w:r>
+      <w:r>
+        <w:t xml:space="preserve">Arcos-Aguilar et al. showed that a large share of marketed dive sites still lie outside protected areas, while wildlife encounters that define the dive experience are more likely in managed or no-take waters. We therefore treat the priority list as places that</w:t>
+      </w:r>
+      <w:r>
+        <w:t xml:space="preserve"> </w:t>
+      </w:r>
+      <w:r>
+        <w:rPr>
+          <w:bCs/>
+          <w:b/>
+        </w:rPr>
+        <w:t xml:space="preserve">have been isolated as sites that would benefit from lying within a protected area</w:t>
+      </w:r>
+      <w:r>
+        <w:t xml:space="preserve">. For Sense of Place, the</w:t>
+      </w:r>
+      <w:r>
+        <w:t xml:space="preserve"> </w:t>
+      </w:r>
+      <w:r>
+        <w:rPr>
+          <w:bCs/>
+          <w:b/>
+        </w:rPr>
+        <w:t xml:space="preserve">ideal reference condition</w:t>
+      </w:r>
+      <w:r>
+        <w:t xml:space="preserve"> </w:t>
+      </w:r>
+      <w:r>
+        <w:t xml:space="preserve">is that</w:t>
+      </w:r>
+      <w:r>
+        <w:t xml:space="preserve"> </w:t>
+      </w:r>
+      <w:r>
+        <w:rPr>
+          <w:bCs/>
+          <w:b/>
+        </w:rPr>
+        <w:t xml:space="preserve">all priority dive sites</w:t>
+      </w:r>
+      <w:r>
+        <w:t xml:space="preserve"> </w:t>
+      </w:r>
+      <w:r>
+        <w:t xml:space="preserve">sit inside managed protected areas or equivalent protections (so communities and visitors can still experience the place that made the trip meaningful). Scoring follows that ideal: inside CONANP/Ramsar areas we use SIMEC i-efectividad (and Ramsar plan rules when they apply); outside, only a weaker minimum under national tourism law remains, so unprotected priority sites pull the score down relative to a fully protected network.</w:t>
+      </w:r>
+    </w:p>
+    <w:p>
+      <w:pPr>
+        <w:pStyle w:val="BodyText"/>
+      </w:pPr>
+      <w:r>
+        <w:rPr>
+          <w:bCs/>
+          <w:b/>
+        </w:rPr>
+        <w:t xml:space="preserve">Why protected dive sites score higher (Scoring rules).</w:t>
+      </w:r>
+      <w:r>
+        <w:t xml:space="preserve"> </w:t>
+      </w:r>
+      <w:r>
+        <w:t xml:space="preserve">Priority dive places are lasting special places because people travel specifically to experience them. Protection helps keep the wildlife, reefs, and underwater features that make the trip meaningful, supports dive-based livelihoods when sites stay high quality, and reduces cumulative damage from use and extractive pressure. Managed protected areas and no-take areas increase the chance that the site remains the place communities and visitors valued. Outside of protected areas, there is still the national dive-tourism law (NOM-012-TUR-2016), but that residual duty of care is intentionally weaker than well-managed protection, because it is not the same as active protected area management for a special place. Therefore:</w:t>
+      </w:r>
+    </w:p>
+    <w:p>
+      <w:pPr>
+        <w:numPr>
+          <w:ilvl w:val="0"/>
+          <w:numId w:val="1023"/>
+        </w:numPr>
+        <w:pStyle w:val="Compact"/>
+      </w:pPr>
+      <w:r>
+        <w:t xml:space="preserve">If the dive site falls in a CONANP and/or Ramsar protected area, use SIMEC and Ramsar plan condition for that area.</w:t>
+      </w:r>
+    </w:p>
+    <w:p>
+      <w:pPr>
+        <w:numPr>
+          <w:ilvl w:val="0"/>
+          <w:numId w:val="1023"/>
+        </w:numPr>
+        <w:pStyle w:val="Compact"/>
+      </w:pPr>
+      <w:r>
+        <w:t xml:space="preserve">If it falls in both, take the maximum of the two condition scores.</w:t>
+      </w:r>
+    </w:p>
+    <w:p>
+      <w:pPr>
+        <w:numPr>
+          <w:ilvl w:val="0"/>
+          <w:numId w:val="1023"/>
+        </w:numPr>
+        <w:pStyle w:val="Compact"/>
+      </w:pPr>
+      <w:r>
+        <w:t xml:space="preserve">If it is outside protected areas, use a non-zero floor from NOM-012-TUR-2016 §6.11 (legal dive tourism rules that apply inside and outside protected natural areas). We determined the score by using the minimum observed SIMEC i-efectividad condition among dive sites that do have a protected-area score (currently</w:t>
+      </w:r>
+      <w:r>
+        <w:t xml:space="preserve"> </w:t>
+      </w:r>
+      <w:r>
+        <w:rPr>
+          <w:bCs/>
+          <w:b/>
+        </w:rPr>
         <w:t xml:space="preserve">58</w:t>
       </w:r>
       <w:r>
@@ -5000,7 +5434,7 @@
         <w:pStyle w:val="FirstParagraph"/>
       </w:pPr>
       <w:r>
-        <w:t xml:space="preserve">Gulf-wide dive sites by overall condition, then Espíritu Santo zoom (inside PA vs outside with tourism-rule floor), then regional scores.</w:t>
+        <w:t xml:space="preserve">Gulf-wide dive sites by overall condition, then Espíritu Santo zoom (inside protected area vs outside with tourism-rule floor), then regional scores.</w:t>
       </w:r>
     </w:p>
     <w:p>
@@ -5012,18 +5446,18 @@
           <wp:inline>
             <wp:extent cx="4533900" cy="4533900"/>
             <wp:effectExtent b="0" l="0" r="0" t="0"/>
-            <wp:docPr descr="Figure 11. Method map of priority dive sites colored by the overall condition we use in scoring. Dive locations come from published priority analyses (Arcos-Aguilar et al. 2021 and GCMP layers). If a site sits inside a CONANP or Ramsar protected area, its condition is the SIMEC and/or Ramsar management score for that area (the higher of the two when both apply). If a site sits outside protected areas, it still receives a non-zero legal floor from Mexico’s dive-tourism standard NOM-012-TUR-2016 section 6.11, which sets operating rules for dive tourism both inside and outside natural protected areas. In prep we set that floor to the minimum park condition observed among dive sites that do have a protected-area score (currently 58)." title="" id="84" name="Picture"/>
+            <wp:docPr descr="Figure 11. Method map of priority dive sites colored by the overall condition we use in scoring. Dive locations come from published priority analyses (Arcos-Aguilar et al. 2021 and GCMP layers). If a site sits inside a CONANP or Ramsar protected area, its condition is the SIMEC i-efectividad and/or Ramsar management-plan score for that area (the higher of the two when both apply). If a site sits outside protected areas, it still receives a non-zero baseline condition under Mexico’s dive-tourism standard NOM-012-TUR-2016 section 6.11, which sets operating rules for dive tourism both inside and outside natural protected areas. In prep, we set that baseline to the minimum SIMEC i-efectividad condition observed among dive sites that do have a protected-area score (currently 58)." title="" id="88" name="Picture"/>
             <a:graphic>
               <a:graphicData uri="http://schemas.openxmlformats.org/drawingml/2006/picture">
                 <pic:pic>
                   <pic:nvPicPr>
-                    <pic:cNvPr descr="../images/sp_lsp_figs/process_priority_dive_sites_condition.png" id="85" name="Picture"/>
+                    <pic:cNvPr descr="../images/sp_lsp_figs/process_priority_dive_sites_condition.png" id="89" name="Picture"/>
                     <pic:cNvPicPr>
                       <a:picLocks noChangeArrowheads="1" noChangeAspect="1"/>
                     </pic:cNvPicPr>
                   </pic:nvPicPr>
                   <pic:blipFill>
-                    <a:blip r:embed="rId83"/>
+                    <a:blip r:embed="rId87"/>
                     <a:stretch>
                       <a:fillRect/>
                     </a:stretch>
@@ -5055,7 +5489,7 @@
         <w:pStyle w:val="ImageCaption"/>
       </w:pPr>
       <w:r>
-        <w:t xml:space="preserve">Figure 11. Method map of priority dive sites colored by the overall condition we use in scoring. Dive locations come from published priority analyses (Arcos-Aguilar et al. 2021 and GCMP layers). If a site sits inside a CONANP or Ramsar protected area, its condition is the SIMEC and/or Ramsar management score for that area (the higher of the two when both apply). If a site sits outside protected areas, it still receives a non-zero legal floor from Mexico’s dive-tourism standard NOM-012-TUR-2016 section 6.11, which sets operating rules for dive tourism both inside and outside natural protected areas. In prep we set that floor to the minimum park condition observed among dive sites that do have a protected-area score (currently 58).</w:t>
+        <w:t xml:space="preserve">Figure 11. Method map of priority dive sites colored by the overall condition we use in scoring. Dive locations come from published priority analyses (Arcos-Aguilar et al. 2021 and GCMP layers). If a site sits inside a CONANP or Ramsar protected area, its condition is the SIMEC i-efectividad and/or Ramsar management-plan score for that area (the higher of the two when both apply). If a site sits outside protected areas, it still receives a non-zero baseline condition under Mexico’s dive-tourism standard NOM-012-TUR-2016 section 6.11, which sets operating rules for dive tourism both inside and outside natural protected areas. In prep, we set that baseline to the minimum SIMEC i-efectividad condition observed among dive sites that do have a protected-area score (currently 58).</w:t>
       </w:r>
     </w:p>
     <w:p>
@@ -5067,18 +5501,18 @@
           <wp:inline>
             <wp:extent cx="4533900" cy="4533900"/>
             <wp:effectExtent b="0" l="0" r="0" t="0"/>
-            <wp:docPr descr="Figure 12. Zoomed method map around Parque Nacional Espiritu Santo to show the inside-versus-outside protected area logic for dive sites more clearly. Sites inside the park inherit the park management condition. Nearby priority sites outside the boundary use the NOM-012-TUR legal floor (currently 58) rather than dropping to zero. This illustrates that unprotected dive tourism is not treated as no protection, but also not as fully equivalent to a well managed park." title="" id="87" name="Picture"/>
+            <wp:docPr descr="Figure 12. Zoomed method map around Parque Nacional Espíritu Santo to show the inside-versus-outside protected area logic for dive sites more clearly. Sites inside a protected area inherit the SIMEC i-efectividad management condition. Nearby priority sites outside the boundary use the NOM-012-TUR statute-based minimum condition (currently 58) rather than dropping to zero. This illustrates that dive tourism outside a protected area is not treated as no protection, but also not as fully equivalent to being located within a well-managed protected area." title="" id="91" name="Picture"/>
             <a:graphic>
               <a:graphicData uri="http://schemas.openxmlformats.org/drawingml/2006/picture">
                 <pic:pic>
                   <pic:nvPicPr>
-                    <pic:cNvPr descr="../images/sp_lsp_figs/process_priority_dive_sites.png" id="88" name="Picture"/>
+                    <pic:cNvPr descr="../images/sp_lsp_figs/process_priority_dive_sites.png" id="92" name="Picture"/>
                     <pic:cNvPicPr>
                       <a:picLocks noChangeArrowheads="1" noChangeAspect="1"/>
                     </pic:cNvPicPr>
                   </pic:nvPicPr>
                   <pic:blipFill>
-                    <a:blip r:embed="rId86"/>
+                    <a:blip r:embed="rId90"/>
                     <a:stretch>
                       <a:fillRect/>
                     </a:stretch>
@@ -5110,7 +5544,7 @@
         <w:pStyle w:val="ImageCaption"/>
       </w:pPr>
       <w:r>
-        <w:t xml:space="preserve">Figure 12. Zoomed method map around Parque Nacional Espiritu Santo to show the inside-versus-outside protected area logic for dive sites more clearly. Sites inside the park inherit the park management condition. Nearby priority sites outside the boundary use the NOM-012-TUR legal floor (currently 58) rather than dropping to zero. This illustrates that unprotected dive tourism is not treated as no protection, but also not as fully equivalent to a well managed park.</w:t>
+        <w:t xml:space="preserve">Figure 12. Zoomed method map around Parque Nacional Espíritu Santo to show the inside-versus-outside protected area logic for dive sites more clearly. Sites inside a protected area inherit the SIMEC i-efectividad management condition. Nearby priority sites outside the boundary use the NOM-012-TUR statute-based minimum condition (currently 58) rather than dropping to zero. This illustrates that dive tourism outside a protected area is not treated as no protection, but also not as fully equivalent to being located within a well-managed protected area.</w:t>
       </w:r>
     </w:p>
     <w:p>
@@ -5122,18 +5556,18 @@
           <wp:inline>
             <wp:extent cx="4000500" cy="4000499"/>
             <wp:effectExtent b="0" l="0" r="0" t="0"/>
-            <wp:docPr descr="Figure 13. Regional priority dive site scores. Each region averages condition across its priority dive sites after the protected-area and legal-floor rules in Figures 11 and 12. Higher scores mean the set of iconic dive places in that region is, on average, better covered by managed parks or at least by the national dive-tourism legal baseline." title="" id="90" name="Picture"/>
+            <wp:docPr descr="Figure 13. Regional priority dive site scores. Each region averages condition across its priority dive sites after the protected-area and statute-based rules in Figures 11 and 12. Higher scores mean the set of priority dive places in that region is, on average, better covered by managed protected areas (SIMEC i-efectividad) or at least by the national dive-tourism legal baseline." title="" id="94" name="Picture"/>
             <a:graphic>
               <a:graphicData uri="http://schemas.openxmlformats.org/drawingml/2006/picture">
                 <pic:pic>
                   <pic:nvPicPr>
-                    <pic:cNvPr descr="../images/sp_lsp_figs/lsp_priority_dive_sites.png" id="91" name="Picture"/>
+                    <pic:cNvPr descr="../images/sp_lsp_figs/lsp_priority_dive_sites.png" id="95" name="Picture"/>
                     <pic:cNvPicPr>
                       <a:picLocks noChangeArrowheads="1" noChangeAspect="1"/>
                     </pic:cNvPicPr>
                   </pic:nvPicPr>
                   <pic:blipFill>
-                    <a:blip r:embed="rId89"/>
+                    <a:blip r:embed="rId93"/>
                     <a:stretch>
                       <a:fillRect/>
                     </a:stretch>
@@ -5165,7 +5599,7 @@
         <w:pStyle w:val="ImageCaption"/>
       </w:pPr>
       <w:r>
-        <w:t xml:space="preserve">Figure 13. Regional priority dive site scores. Each region averages condition across its priority dive sites after the protected-area and legal-floor rules in Figures 11 and 12. Higher scores mean the set of iconic dive places in that region is, on average, better covered by managed parks or at least by the national dive-tourism legal baseline.</w:t>
+        <w:t xml:space="preserve">Figure 13. Regional priority dive site scores. Each region averages condition across its priority dive sites after the protected-area and statute-based rules in Figures 11 and 12. Higher scores mean the set of priority dive places in that region is, on average, better covered by managed protected areas (SIMEC i-efectividad) or at least by the national dive-tourism legal baseline.</w:t>
       </w:r>
     </w:p>
     <w:p>
@@ -5184,19 +5618,58 @@
       <w:pPr>
         <w:numPr>
           <w:ilvl w:val="0"/>
-          <w:numId w:val="1023"/>
-        </w:numPr>
-        <w:pStyle w:val="Compact"/>
-      </w:pPr>
-      <w:r>
-        <w:t xml:space="preserve">Arcos-Aguilar et al. 2021 and CBMC GCMP dive site layers and priority table</w:t>
-      </w:r>
-    </w:p>
-    <w:p>
-      <w:pPr>
-        <w:numPr>
-          <w:ilvl w:val="0"/>
-          <w:numId w:val="1023"/>
+          <w:numId w:val="1024"/>
+        </w:numPr>
+        <w:pStyle w:val="Compact"/>
+      </w:pPr>
+      <w:r>
+        <w:t xml:space="preserve">Arcos-Aguilar, R., F. Favoretto, J.A. Kumagai, V. Jiménez-Esquivel, A.L. Martínez-Cruz, and O. Aburto-Oropeza. 2021. Diving tourism in Mexico – Economic and conservation importance.</w:t>
+      </w:r>
+      <w:r>
+        <w:t xml:space="preserve"> </w:t>
+      </w:r>
+      <w:r>
+        <w:rPr>
+          <w:iCs/>
+          <w:i/>
+        </w:rPr>
+        <w:t xml:space="preserve">Marine Policy</w:t>
+      </w:r>
+      <w:r>
+        <w:t xml:space="preserve"> </w:t>
+      </w:r>
+      <w:r>
+        <w:t xml:space="preserve">126: 104410.</w:t>
+      </w:r>
+      <w:r>
+        <w:t xml:space="preserve"> </w:t>
+      </w:r>
+      <w:hyperlink r:id="rId86">
+        <w:r>
+          <w:rPr>
+            <w:rStyle w:val="Hyperlink"/>
+          </w:rPr>
+          <w:t xml:space="preserve">https://doi.org/10.1016/j.marpol.2021.104410</w:t>
+        </w:r>
+      </w:hyperlink>
+    </w:p>
+    <w:p>
+      <w:pPr>
+        <w:numPr>
+          <w:ilvl w:val="0"/>
+          <w:numId w:val="1024"/>
+        </w:numPr>
+        <w:pStyle w:val="Compact"/>
+      </w:pPr>
+      <w:r>
+        <w:t xml:space="preserve">CBMC GCMP dive site layers and prioritization of diving sites table (coordinates and priority fields used in prep)</w:t>
+      </w:r>
+    </w:p>
+    <w:p>
+      <w:pPr>
+        <w:numPr>
+          <w:ilvl w:val="0"/>
+          <w:numId w:val="1024"/>
         </w:numPr>
         <w:pStyle w:val="Compact"/>
       </w:pPr>
@@ -5208,7 +5681,7 @@
       <w:pPr>
         <w:numPr>
           <w:ilvl w:val="0"/>
-          <w:numId w:val="1023"/>
+          <w:numId w:val="1024"/>
         </w:numPr>
         <w:pStyle w:val="Compact"/>
       </w:pPr>
@@ -5220,11 +5693,11 @@
       <w:pPr>
         <w:numPr>
           <w:ilvl w:val="0"/>
-          <w:numId w:val="1023"/>
-        </w:numPr>
-        <w:pStyle w:val="Compact"/>
-      </w:pPr>
-      <w:hyperlink r:id="rId92">
+          <w:numId w:val="1024"/>
+        </w:numPr>
+        <w:pStyle w:val="Compact"/>
+      </w:pPr>
+      <w:hyperlink r:id="rId96">
         <w:r>
           <w:rPr>
             <w:rStyle w:val="Hyperlink"/>
@@ -5239,8 +5712,8 @@
         <w:t xml:space="preserve">§6.11 (dive tourism rules inside and outside protected natural areas)</w:t>
       </w:r>
     </w:p>
-    <w:bookmarkEnd w:id="93"/>
-    <w:bookmarkStart w:id="102" w:name="iconic-fishing-spots"/>
+    <w:bookmarkEnd w:id="97"/>
+    <w:bookmarkStart w:id="106" w:name="iconic-fishing-spots"/>
     <w:p>
       <w:pPr>
         <w:pStyle w:val="Heading3"/>
@@ -5345,7 +5818,7 @@
       <w:pPr>
         <w:numPr>
           <w:ilvl w:val="0"/>
-          <w:numId w:val="1024"/>
+          <w:numId w:val="1025"/>
         </w:numPr>
         <w:pStyle w:val="Compact"/>
       </w:pPr>
@@ -5357,7 +5830,7 @@
       <w:pPr>
         <w:numPr>
           <w:ilvl w:val="0"/>
-          <w:numId w:val="1024"/>
+          <w:numId w:val="1025"/>
         </w:numPr>
         <w:pStyle w:val="Compact"/>
       </w:pPr>
@@ -5369,7 +5842,7 @@
       <w:pPr>
         <w:numPr>
           <w:ilvl w:val="0"/>
-          <w:numId w:val="1024"/>
+          <w:numId w:val="1025"/>
         </w:numPr>
         <w:pStyle w:val="Compact"/>
       </w:pPr>
@@ -5455,18 +5928,18 @@
           <wp:inline>
             <wp:extent cx="4533900" cy="4533900"/>
             <wp:effectExtent b="0" l="0" r="0" t="0"/>
-            <wp:docPr descr="Figure 14. Method map of iconic fishing places labeled by the protection pathway that sets their score. Coordinates come from Expert Working Group inventory of historically important fishing places. A ZRP (zona de refugio pesquero, or fishing refuge zone) is a designated Mexican marine or coastal area where fishing is partly or fully restricted to protect marine life, allow depleted stocks to recover, and support sustainable use by local fishers; sites inside a ZRP score 100. A TURF (territorial use right in fisheries) is a cooperative fishing territory where fishing rights are allocated to a defined community; sites confirmed as TURF also score 100 (based on Aceves-Bueno et al. 2023 review, since nationwide TURF polygons are not easily downloaded for batch processing). Other sites inside relevant protected areas use SIMEC or Ramsar plan scores. Remaining sites fall in the Other class under this hierarchy." title="" id="95" name="Picture"/>
+            <wp:docPr descr="Figure 14. Method map of iconic fishing places labeled by the protection pathway that sets their score. Coordinates come from the Expert Working Group inventory of historically important fishing places. A ZRP (zona de refugio pesquero, or fishing refuge zone) is a designated Mexican marine or coastal area where fishing is partly or fully restricted to protect marine life, allow depleted stocks to recover, and support sustainable use by local fishers; sites inside a ZRP score 100. A TURF (territorial use right in fisheries) is a cooperative fishing territory where fishing rights are allocated to a defined community; sites confirmed as TURF also score 100 (based on Aceves-Bueno et al. 2023 review, since nationwide TURF polygons are not easily downloaded for batch processing). Other sites inside relevant protected areas use SIMEC i-efectividad or Ramsar plan scores. Remaining sites fall in the Other class under this hierarchy." title="" id="99" name="Picture"/>
             <a:graphic>
               <a:graphicData uri="http://schemas.openxmlformats.org/drawingml/2006/picture">
                 <pic:pic>
                   <pic:nvPicPr>
-                    <pic:cNvPr descr="../images/sp_lsp_figs/process_iconic_fishing_gulf.png" id="96" name="Picture"/>
+                    <pic:cNvPr descr="../images/sp_lsp_figs/process_iconic_fishing_gulf.png" id="100" name="Picture"/>
                     <pic:cNvPicPr>
                       <a:picLocks noChangeArrowheads="1" noChangeAspect="1"/>
                     </pic:cNvPicPr>
                   </pic:nvPicPr>
                   <pic:blipFill>
-                    <a:blip r:embed="rId94"/>
+                    <a:blip r:embed="rId98"/>
                     <a:stretch>
                       <a:fillRect/>
                     </a:stretch>
@@ -5498,7 +5971,7 @@
         <w:pStyle w:val="ImageCaption"/>
       </w:pPr>
       <w:r>
-        <w:t xml:space="preserve">Figure 14. Method map of iconic fishing places labeled by the protection pathway that sets their score. Coordinates come from Expert Working Group inventory of historically important fishing places. A ZRP (zona de refugio pesquero, or fishing refuge zone) is a designated Mexican marine or coastal area where fishing is partly or fully restricted to protect marine life, allow depleted stocks to recover, and support sustainable use by local fishers; sites inside a ZRP score 100. A TURF (territorial use right in fisheries) is a cooperative fishing territory where fishing rights are allocated to a defined community; sites confirmed as TURF also score 100 (based on Aceves-Bueno et al. 2023 review, since nationwide TURF polygons are not easily downloaded for batch processing). Other sites inside relevant protected areas use SIMEC or Ramsar plan scores. Remaining sites fall in the Other class under this hierarchy.</w:t>
+        <w:t xml:space="preserve">Figure 14. Method map of iconic fishing places labeled by the protection pathway that sets their score. Coordinates come from the Expert Working Group inventory of historically important fishing places. A ZRP (zona de refugio pesquero, or fishing refuge zone) is a designated Mexican marine or coastal area where fishing is partly or fully restricted to protect marine life, allow depleted stocks to recover, and support sustainable use by local fishers; sites inside a ZRP score 100. A TURF (territorial use right in fisheries) is a cooperative fishing territory where fishing rights are allocated to a defined community; sites confirmed as TURF also score 100 (based on Aceves-Bueno et al. 2023 review, since nationwide TURF polygons are not easily downloaded for batch processing). Other sites inside relevant protected areas use SIMEC i-efectividad or Ramsar plan scores. Remaining sites fall in the Other class under this hierarchy.</w:t>
       </w:r>
     </w:p>
     <w:p>
@@ -5510,18 +5983,18 @@
           <wp:inline>
             <wp:extent cx="4000500" cy="4000499"/>
             <wp:effectExtent b="0" l="0" r="0" t="0"/>
-            <wp:docPr descr="Figure 15. Regional iconic fishing scores after applying the ZRP, TURF, and protected-area rules. Higher regional scores mean expert-listed fishing places in that region sit, on average, inside stronger fishery or park protections." title="" id="98" name="Picture"/>
+            <wp:docPr descr="Figure 15. Regional iconic fishing scores after applying the ZRP, TURF, and protected-area rules. Higher regional scores mean expert-listed fishing places in that region sit, on average, inside stronger fishery or protected area protections." title="" id="102" name="Picture"/>
             <a:graphic>
               <a:graphicData uri="http://schemas.openxmlformats.org/drawingml/2006/picture">
                 <pic:pic>
                   <pic:nvPicPr>
-                    <pic:cNvPr descr="../images/sp_lsp_figs/lsp_iconic_fishing_spots.png" id="99" name="Picture"/>
+                    <pic:cNvPr descr="../images/sp_lsp_figs/lsp_iconic_fishing_spots.png" id="103" name="Picture"/>
                     <pic:cNvPicPr>
                       <a:picLocks noChangeArrowheads="1" noChangeAspect="1"/>
                     </pic:cNvPicPr>
                   </pic:nvPicPr>
                   <pic:blipFill>
-                    <a:blip r:embed="rId97"/>
+                    <a:blip r:embed="rId101"/>
                     <a:stretch>
                       <a:fillRect/>
                     </a:stretch>
@@ -5553,7 +6026,7 @@
         <w:pStyle w:val="ImageCaption"/>
       </w:pPr>
       <w:r>
-        <w:t xml:space="preserve">Figure 15. Regional iconic fishing scores after applying the ZRP, TURF, and protected-area rules. Higher regional scores mean expert-listed fishing places in that region sit, on average, inside stronger fishery or park protections.</w:t>
+        <w:t xml:space="preserve">Figure 15. Regional iconic fishing scores after applying the ZRP, TURF, and protected-area rules. Higher regional scores mean expert-listed fishing places in that region sit, on average, inside stronger fishery or protected area protections.</w:t>
       </w:r>
     </w:p>
     <w:p>
@@ -5572,7 +6045,7 @@
       <w:pPr>
         <w:numPr>
           <w:ilvl w:val="0"/>
-          <w:numId w:val="1025"/>
+          <w:numId w:val="1026"/>
         </w:numPr>
         <w:pStyle w:val="Compact"/>
       </w:pPr>
@@ -5584,7 +6057,7 @@
       <w:pPr>
         <w:numPr>
           <w:ilvl w:val="0"/>
-          <w:numId w:val="1025"/>
+          <w:numId w:val="1026"/>
         </w:numPr>
         <w:pStyle w:val="Compact"/>
       </w:pPr>
@@ -5596,7 +6069,7 @@
       <w:pPr>
         <w:numPr>
           <w:ilvl w:val="0"/>
-          <w:numId w:val="1025"/>
+          <w:numId w:val="1026"/>
         </w:numPr>
         <w:pStyle w:val="Compact"/>
       </w:pPr>
@@ -5619,7 +6092,7 @@
       <w:r>
         <w:t xml:space="preserve">(</w:t>
       </w:r>
-      <w:hyperlink r:id="rId100">
+      <w:hyperlink r:id="rId104">
         <w:r>
           <w:rPr>
             <w:rStyle w:val="Hyperlink"/>
@@ -5633,7 +6106,7 @@
       <w:r>
         <w:t xml:space="preserve"> </w:t>
       </w:r>
-      <w:hyperlink r:id="rId101">
+      <w:hyperlink r:id="rId105">
         <w:r>
           <w:rPr>
             <w:rStyle w:val="Hyperlink"/>
@@ -5646,7 +6119,7 @@
       <w:pPr>
         <w:numPr>
           <w:ilvl w:val="0"/>
-          <w:numId w:val="1025"/>
+          <w:numId w:val="1026"/>
         </w:numPr>
         <w:pStyle w:val="Compact"/>
       </w:pPr>
@@ -5654,8 +6127,8 @@
         <w:t xml:space="preserve">SIMEC and Ramsar plan rules when fishing sites overlap protected areas</w:t>
       </w:r>
     </w:p>
-    <w:bookmarkEnd w:id="102"/>
-    <w:bookmarkStart w:id="113" w:name="archaeological-sites"/>
+    <w:bookmarkEnd w:id="106"/>
+    <w:bookmarkStart w:id="117" w:name="archaeological-sites"/>
     <w:p>
       <w:pPr>
         <w:pStyle w:val="Heading3"/>
@@ -5715,7 +6188,7 @@
       <w:r>
         <w:t xml:space="preserve">(National Institute of Anthropology and History), created in 1939 to conserve, study, and share the country’s archaeological, historical, and related heritage. INAH oversees archaeological zones open to the public, historical monuments, research, cataloging, and restoration nationwide. Public-facing entry points include the archaeological zones pages (</w:t>
       </w:r>
-      <w:hyperlink r:id="rId103">
+      <w:hyperlink r:id="rId107">
         <w:r>
           <w:rPr>
             <w:rStyle w:val="Hyperlink"/>
@@ -5726,7 +6199,7 @@
       <w:r>
         <w:t xml:space="preserve">) and the historical monuments coordination (</w:t>
       </w:r>
-      <w:hyperlink r:id="rId104">
+      <w:hyperlink r:id="rId108">
         <w:r>
           <w:rPr>
             <w:rStyle w:val="Hyperlink"/>
@@ -5742,7 +6215,7 @@
       <w:pPr>
         <w:numPr>
           <w:ilvl w:val="0"/>
-          <w:numId w:val="1026"/>
+          <w:numId w:val="1027"/>
         </w:numPr>
         <w:pStyle w:val="Compact"/>
       </w:pPr>
@@ -5754,7 +6227,7 @@
       <w:pPr>
         <w:numPr>
           <w:ilvl w:val="0"/>
-          <w:numId w:val="1026"/>
+          <w:numId w:val="1027"/>
         </w:numPr>
         <w:pStyle w:val="Compact"/>
       </w:pPr>
@@ -5766,7 +6239,7 @@
       <w:pPr>
         <w:numPr>
           <w:ilvl w:val="0"/>
-          <w:numId w:val="1026"/>
+          <w:numId w:val="1027"/>
         </w:numPr>
         <w:pStyle w:val="Compact"/>
       </w:pPr>
@@ -5849,18 +6322,18 @@
           <wp:inline>
             <wp:extent cx="4533900" cy="4533900"/>
             <wp:effectExtent b="0" l="0" r="0" t="0"/>
-            <wp:docPr descr="Figure 16. Method map of archaeological and related cultural sites scored for Lasting Special Places. These are places where material remains make the surrounding coast culturally and spiritually special, such as shell middens. INAH is Mexico’s Instituto Nacional de Antropologia e Historia (National Institute of Anthropology and History; see https://www.inah.gob.mx/zonas-arqueologicas and https://monumentoshistoricos.inah.gob.mx/). Created in 1939, INAH oversees conservation, research, and public access for archaeological zones, monuments, and related heritage nationwide. If an Expert Working Group site falls within about 10 km of an official INAH inventory point, we treat it as under that heritage-management system and score 100. If not, but the site is near or inside a natural protected area with a management effectiveness score, we use that park score. Otherwise we assign a lower legal floor of 30, reflecting partial cover under the Federal Law on Archaeological, Artistic, and Historic Monuments and Zones even when a site is not formally managed as an open INAH zone." title="" id="106" name="Picture"/>
+            <wp:docPr descr="Figure 16. Method map of archaeological and related cultural sites scored for Lasting Special Places. These are places where material remains make the surrounding coast culturally and spiritually special, such as shell middens. INAH is Mexico’s Instituto Nacional de Antropología e Historia (National Institute of Anthropology and History; see https://www.inah.gob.mx/zonas-arqueologicas and https://monumentoshistoricos.inah.gob.mx/). Created in 1939, INAH oversees conservation, research, and public access for archaeological zones, monuments, and related heritage nationwide. If an Expert Working Group site falls within about 10 km of an official INAH inventory point, we treat it as under that heritage-management system and score 100. If not, but the site is near or inside a natural protected area with a management effectiveness score, we use that SIMEC i-efectividad score. Otherwise we assign a lower statute-based minimum of 30, reflecting partial cover under the Federal Law on Archaeological, Artistic, and Historic Monuments and Zones even when a site is not formally managed as an open INAH zone." title="" id="110" name="Picture"/>
             <a:graphic>
               <a:graphicData uri="http://schemas.openxmlformats.org/drawingml/2006/picture">
                 <pic:pic>
                   <pic:nvPicPr>
-                    <pic:cNvPr descr="../images/sp_lsp_figs/process_archaeological_buffers.png" id="107" name="Picture"/>
+                    <pic:cNvPr descr="../images/sp_lsp_figs/process_archaeological_buffers.png" id="111" name="Picture"/>
                     <pic:cNvPicPr>
                       <a:picLocks noChangeArrowheads="1" noChangeAspect="1"/>
                     </pic:cNvPicPr>
                   </pic:nvPicPr>
                   <pic:blipFill>
-                    <a:blip r:embed="rId105"/>
+                    <a:blip r:embed="rId109"/>
                     <a:stretch>
                       <a:fillRect/>
                     </a:stretch>
@@ -5892,7 +6365,7 @@
         <w:pStyle w:val="ImageCaption"/>
       </w:pPr>
       <w:r>
-        <w:t xml:space="preserve">Figure 16. Method map of archaeological and related cultural sites scored for Lasting Special Places. These are places where material remains make the surrounding coast culturally and spiritually special, such as shell middens. INAH is Mexico’s Instituto Nacional de Antropologia e Historia (National Institute of Anthropology and History; see https://www.inah.gob.mx/zonas-arqueologicas and https://monumentoshistoricos.inah.gob.mx/). Created in 1939, INAH oversees conservation, research, and public access for archaeological zones, monuments, and related heritage nationwide. If an Expert Working Group site falls within about 10 km of an official INAH inventory point, we treat it as under that heritage-management system and score 100. If not, but the site is near or inside a natural protected area with a management effectiveness score, we use that park score. Otherwise we assign a lower legal floor of 30, reflecting partial cover under the Federal Law on Archaeological, Artistic, and Historic Monuments and Zones even when a site is not formally managed as an open INAH zone.</w:t>
+        <w:t xml:space="preserve">Figure 16. Method map of archaeological and related cultural sites scored for Lasting Special Places. These are places where material remains make the surrounding coast culturally and spiritually special, such as shell middens. INAH is Mexico’s Instituto Nacional de Antropología e Historia (National Institute of Anthropology and History; see https://www.inah.gob.mx/zonas-arqueologicas and https://monumentoshistoricos.inah.gob.mx/). Created in 1939, INAH oversees conservation, research, and public access for archaeological zones, monuments, and related heritage nationwide. If an Expert Working Group site falls within about 10 km of an official INAH inventory point, we treat it as under that heritage-management system and score 100. If not, but the site is near or inside a natural protected area with a management effectiveness score, we use that SIMEC i-efectividad score. Otherwise we assign a lower statute-based minimum of 30, reflecting partial cover under the Federal Law on Archaeological, Artistic, and Historic Monuments and Zones even when a site is not formally managed as an open INAH zone.</w:t>
       </w:r>
     </w:p>
     <w:p>
@@ -5904,18 +6377,18 @@
           <wp:inline>
             <wp:extent cx="4000500" cy="4000499"/>
             <wp:effectExtent b="0" l="0" r="0" t="0"/>
-            <wp:docPr descr="Figure 17. Regional archaeological site scores after the INAH, protected-area, and legal-floor hierarchy. Higher scores mean expert-listed heritage places in that region are more often matched to formal INAH inventory or to managed park protection rather than the residual legal floor alone." title="" id="109" name="Picture"/>
+            <wp:docPr descr="Figure 17. Regional archaeological site scores after the INAH, protected-area, and statute-based hierarchy. Higher scores mean expert-listed heritage places in that region are more often matched to formal INAH inventory or to managed protected area protection (SIMEC i-efectividad) rather than the residual statute-based minimum alone." title="" id="113" name="Picture"/>
             <a:graphic>
               <a:graphicData uri="http://schemas.openxmlformats.org/drawingml/2006/picture">
                 <pic:pic>
                   <pic:nvPicPr>
-                    <pic:cNvPr descr="../images/sp_lsp_figs/lsp_archaeological_sites.png" id="110" name="Picture"/>
+                    <pic:cNvPr descr="../images/sp_lsp_figs/lsp_archaeological_sites.png" id="114" name="Picture"/>
                     <pic:cNvPicPr>
                       <a:picLocks noChangeArrowheads="1" noChangeAspect="1"/>
                     </pic:cNvPicPr>
                   </pic:nvPicPr>
                   <pic:blipFill>
-                    <a:blip r:embed="rId108"/>
+                    <a:blip r:embed="rId112"/>
                     <a:stretch>
                       <a:fillRect/>
                     </a:stretch>
@@ -5947,7 +6420,7 @@
         <w:pStyle w:val="ImageCaption"/>
       </w:pPr>
       <w:r>
-        <w:t xml:space="preserve">Figure 17. Regional archaeological site scores after the INAH, protected-area, and legal-floor hierarchy. Higher scores mean expert-listed heritage places in that region are more often matched to formal INAH inventory or to managed park protection rather than the residual legal floor alone.</w:t>
+        <w:t xml:space="preserve">Figure 17. Regional archaeological site scores after the INAH, protected-area, and statute-based hierarchy. Higher scores mean expert-listed heritage places in that region are more often matched to formal INAH inventory or to managed protected area protection (SIMEC i-efectividad) rather than the residual statute-based minimum alone.</w:t>
       </w:r>
     </w:p>
     <w:p>
@@ -5966,7 +6439,7 @@
       <w:pPr>
         <w:numPr>
           <w:ilvl w:val="0"/>
-          <w:numId w:val="1027"/>
+          <w:numId w:val="1028"/>
         </w:numPr>
         <w:pStyle w:val="Compact"/>
       </w:pPr>
@@ -5978,11 +6451,11 @@
       <w:pPr>
         <w:numPr>
           <w:ilvl w:val="0"/>
-          <w:numId w:val="1027"/>
-        </w:numPr>
-        <w:pStyle w:val="Compact"/>
-      </w:pPr>
-      <w:hyperlink r:id="rId70">
+          <w:numId w:val="1028"/>
+        </w:numPr>
+        <w:pStyle w:val="Compact"/>
+      </w:pPr>
+      <w:hyperlink r:id="rId73">
         <w:r>
           <w:rPr>
             <w:rStyle w:val="Hyperlink"/>
@@ -5995,7 +6468,7 @@
       <w:pPr>
         <w:numPr>
           <w:ilvl w:val="0"/>
-          <w:numId w:val="1027"/>
+          <w:numId w:val="1028"/>
         </w:numPr>
         <w:pStyle w:val="Compact"/>
       </w:pPr>
@@ -6017,7 +6490,7 @@
       <w:pPr>
         <w:numPr>
           <w:ilvl w:val="0"/>
-          <w:numId w:val="1027"/>
+          <w:numId w:val="1028"/>
         </w:numPr>
         <w:pStyle w:val="Compact"/>
       </w:pPr>
@@ -6029,14 +6502,14 @@
       <w:pPr>
         <w:numPr>
           <w:ilvl w:val="0"/>
-          <w:numId w:val="1027"/>
+          <w:numId w:val="1028"/>
         </w:numPr>
         <w:pStyle w:val="Compact"/>
       </w:pPr>
       <w:r>
         <w:t xml:space="preserve">Regional archaeology context for the Upper Gulf (e.g. </w:t>
       </w:r>
-      <w:hyperlink r:id="rId111">
+      <w:hyperlink r:id="rId115">
         <w:r>
           <w:rPr>
             <w:rStyle w:val="Hyperlink"/>
@@ -6050,7 +6523,7 @@
       <w:r>
         <w:t xml:space="preserve"> </w:t>
       </w:r>
-      <w:hyperlink r:id="rId112">
+      <w:hyperlink r:id="rId116">
         <w:r>
           <w:rPr>
             <w:rStyle w:val="Hyperlink"/>
@@ -6062,8 +6535,8 @@
         <w:t xml:space="preserve">)</w:t>
       </w:r>
     </w:p>
-    <w:bookmarkEnd w:id="113"/>
-    <w:bookmarkStart w:id="123" w:name="special-habitats"/>
+    <w:bookmarkEnd w:id="117"/>
+    <w:bookmarkStart w:id="127" w:name="special-habitats"/>
     <w:p>
       <w:pPr>
         <w:pStyle w:val="Heading3"/>
@@ -6084,7 +6557,7 @@
       <w:pPr>
         <w:numPr>
           <w:ilvl w:val="0"/>
-          <w:numId w:val="1028"/>
+          <w:numId w:val="1029"/>
         </w:numPr>
         <w:pStyle w:val="Compact"/>
       </w:pPr>
@@ -6096,24 +6569,24 @@
       <w:pPr>
         <w:numPr>
           <w:ilvl w:val="0"/>
-          <w:numId w:val="1028"/>
-        </w:numPr>
-        <w:pStyle w:val="Compact"/>
-      </w:pPr>
-      <w:r>
-        <w:t xml:space="preserve">Else use a legal floor by habitat type (about 70 for mangrove, seagrass, and coral; 30 for coquina when there is no dedicated coquina statute).</w:t>
-      </w:r>
-    </w:p>
-    <w:p>
-      <w:pPr>
-        <w:numPr>
-          <w:ilvl w:val="0"/>
-          <w:numId w:val="1028"/>
-        </w:numPr>
-        <w:pStyle w:val="Compact"/>
-      </w:pPr>
-      <w:r>
-        <w:t xml:space="preserve">Take the better of the park score and the legal floor so strong legal cover cannot score below what the law already implies.</w:t>
+          <w:numId w:val="1029"/>
+        </w:numPr>
+        <w:pStyle w:val="Compact"/>
+      </w:pPr>
+      <w:r>
+        <w:t xml:space="preserve">Else use a statute-based minimum by habitat type (about 70 for mangrove, seagrass, and coral; 30 for coquina when there is no dedicated coquina statute). These scores are chosen to reflect how well the codified regulations are protecting the special habitat, comparatively. We will require expert input on this.</w:t>
+      </w:r>
+    </w:p>
+    <w:p>
+      <w:pPr>
+        <w:numPr>
+          <w:ilvl w:val="0"/>
+          <w:numId w:val="1029"/>
+        </w:numPr>
+        <w:pStyle w:val="Compact"/>
+      </w:pPr>
+      <w:r>
+        <w:t xml:space="preserve">Take the better of the protected area score (SIMEC i-efectividad or Ramsar plan rules) and that statute-based minimum.</w:t>
       </w:r>
     </w:p>
     <w:p>
@@ -6121,7 +6594,7 @@
         <w:pStyle w:val="FirstParagraph"/>
       </w:pPr>
       <w:r>
-        <w:t xml:space="preserve">Type means by region, coquina PA-touch example, then regional special-habitats scores.</w:t>
+        <w:t xml:space="preserve">Type means by region, coquina example, then regional special-habitats scores.</w:t>
       </w:r>
     </w:p>
     <w:p>
@@ -6133,18 +6606,18 @@
           <wp:inline>
             <wp:extent cx="4533900" cy="4533900"/>
             <wp:effectExtent b="0" l="0" r="0" t="0"/>
-            <wp:docPr descr="Figure 18. Special habitats method map summarizing condition inputs by habitat type (mangrove, seagrass, coral, and coquina). Coral is limited to expert-named reefs in the region where those reefs matter for this assessment. Habitat extents come from mapped layers (for example TNC geoportal habitat layers and mangrove land cover). Colors and means in this map help show how different habitat types contribute before we roll them up to a single regional special-habitats score." title="" id="115" name="Picture"/>
+            <wp:docPr descr="Figure 18. Special habitats method map summarizing condition inputs by habitat type (mangrove, seagrass, coral, and coquina). Coral is limited to expert-named reefs in the region where those reefs matter for this assessment. Habitat extents come from mapped layers (for example TNC geoportal habitat layers and mangrove land cover). Colors and means in this map help show how different habitat types contribute before we roll them up to a single regional special-habitats score." title="" id="119" name="Picture"/>
             <a:graphic>
               <a:graphicData uri="http://schemas.openxmlformats.org/drawingml/2006/picture">
                 <pic:pic>
                   <pic:nvPicPr>
-                    <pic:cNvPr descr="../images/sp_lsp_figs/process_special_habitats_type_means.png" id="116" name="Picture"/>
+                    <pic:cNvPr descr="../images/sp_lsp_figs/process_special_habitats_type_means.png" id="120" name="Picture"/>
                     <pic:cNvPicPr>
                       <a:picLocks noChangeArrowheads="1" noChangeAspect="1"/>
                     </pic:cNvPicPr>
                   </pic:nvPicPr>
                   <pic:blipFill>
-                    <a:blip r:embed="rId114"/>
+                    <a:blip r:embed="rId118"/>
                     <a:stretch>
                       <a:fillRect/>
                     </a:stretch>
@@ -6188,18 +6661,18 @@
           <wp:inline>
             <wp:extent cx="4533900" cy="4533900"/>
             <wp:effectExtent b="0" l="0" r="0" t="0"/>
-            <wp:docPr descr="Figure 19. Special habitats method map focused on whether habitats touch a managed protected area. We expand park boundaries slightly (about 100 m) so habitats along a park edge can inherit park management scores from SIMEC or Ramsar plan rules. If no park applies, we use a legal floor by habitat type (about 70 for mangrove, seagrass, and coral under strong habitat and biodiversity laws; about 30 for coquina when there is no dedicated coquina statute). Final site condition is the better of the park score and the legal floor so strong law does not score below what existing statute already implies." title="" id="118" name="Picture"/>
+            <wp:docPr descr="Figure 19. Special habitats method map focused on whether habitats touch a managed protected area. We expand protected area boundaries slightly (about 100 m) so habitats along a protected area edge can inherit management scores from SIMEC i-efectividad or Ramsar plan rules. If no protected area applies, we use a statute-based minimum by habitat type (about 70 for mangrove, seagrass, and coral under strong habitat and biodiversity laws; about 30 for coquina when there is no dedicated coquina statute). Final site condition is the better of the SIMEC i-efectividad (or Ramsar plan) score and that statute-based minimum, so strong law does not score below what existing statute already implies." title="" id="122" name="Picture"/>
             <a:graphic>
               <a:graphicData uri="http://schemas.openxmlformats.org/drawingml/2006/picture">
                 <pic:pic>
                   <pic:nvPicPr>
-                    <pic:cNvPr descr="../images/sp_lsp_figs/process_special_habitats_pa_touch.png" id="119" name="Picture"/>
+                    <pic:cNvPr descr="../images/sp_lsp_figs/process_special_habitats_pa_touch.png" id="123" name="Picture"/>
                     <pic:cNvPicPr>
                       <a:picLocks noChangeArrowheads="1" noChangeAspect="1"/>
                     </pic:cNvPicPr>
                   </pic:nvPicPr>
                   <pic:blipFill>
-                    <a:blip r:embed="rId117"/>
+                    <a:blip r:embed="rId121"/>
                     <a:stretch>
                       <a:fillRect/>
                     </a:stretch>
@@ -6231,7 +6704,7 @@
         <w:pStyle w:val="ImageCaption"/>
       </w:pPr>
       <w:r>
-        <w:t xml:space="preserve">Figure 19. Special habitats method map focused on whether habitats touch a managed protected area. We expand park boundaries slightly (about 100 m) so habitats along a park edge can inherit park management scores from SIMEC or Ramsar plan rules. If no park applies, we use a legal floor by habitat type (about 70 for mangrove, seagrass, and coral under strong habitat and biodiversity laws; about 30 for coquina when there is no dedicated coquina statute). Final site condition is the better of the park score and the legal floor so strong law does not score below what existing statute already implies.</w:t>
+        <w:t xml:space="preserve">Figure 19. Special habitats method map focused on whether habitats touch a managed protected area. We expand protected area boundaries slightly (about 100 m) so habitats along a protected area edge can inherit management scores from SIMEC i-efectividad or Ramsar plan rules. If no protected area applies, we use a statute-based minimum by habitat type (about 70 for mangrove, seagrass, and coral under strong habitat and biodiversity laws; about 30 for coquina when there is no dedicated coquina statute). Final site condition is the better of the SIMEC i-efectividad (or Ramsar plan) score and that statute-based minimum, so strong law does not score below what existing statute already implies.</w:t>
       </w:r>
     </w:p>
     <w:p>
@@ -6243,18 +6716,18 @@
           <wp:inline>
             <wp:extent cx="4000500" cy="4000499"/>
             <wp:effectExtent b="0" l="0" r="0" t="0"/>
-            <wp:docPr descr="Figure 20. Regional special habitats scores after protected-area touch and legal-floor rules. Higher values mean the mangroves, seagrasses, corals, and coquina features in that region are, on average, under stronger managed or legal protection." title="" id="121" name="Picture"/>
+            <wp:docPr descr="Figure 20. Regional special habitats scores after averaging across habitat types in each region. Higher values mean the mangroves, seagrasses, corals, and coquina features in that region are, on average, under stronger management (including SIMEC i-efectividad when a habitat touches a protected area) or stronger statute-based protection." title="" id="125" name="Picture"/>
             <a:graphic>
               <a:graphicData uri="http://schemas.openxmlformats.org/drawingml/2006/picture">
                 <pic:pic>
                   <pic:nvPicPr>
-                    <pic:cNvPr descr="../images/sp_lsp_figs/lsp_special_habitats.png" id="122" name="Picture"/>
+                    <pic:cNvPr descr="../images/sp_lsp_figs/lsp_special_habitats.png" id="126" name="Picture"/>
                     <pic:cNvPicPr>
                       <a:picLocks noChangeArrowheads="1" noChangeAspect="1"/>
                     </pic:cNvPicPr>
                   </pic:nvPicPr>
                   <pic:blipFill>
-                    <a:blip r:embed="rId120"/>
+                    <a:blip r:embed="rId124"/>
                     <a:stretch>
                       <a:fillRect/>
                     </a:stretch>
@@ -6286,7 +6759,7 @@
         <w:pStyle w:val="ImageCaption"/>
       </w:pPr>
       <w:r>
-        <w:t xml:space="preserve">Figure 20. Regional special habitats scores after protected-area touch and legal-floor rules. Higher values mean the mangroves, seagrasses, corals, and coquina features in that region are, on average, under stronger managed or legal protection.</w:t>
+        <w:t xml:space="preserve">Figure 20. Regional special habitats scores after averaging across habitat types in each region. Higher values mean the mangroves, seagrasses, corals, and coquina features in that region are, on average, under stronger management (including SIMEC i-efectividad when a habitat touches a protected area) or stronger statute-based protection.</w:t>
       </w:r>
     </w:p>
     <w:p>
@@ -6305,7 +6778,7 @@
       <w:pPr>
         <w:numPr>
           <w:ilvl w:val="0"/>
-          <w:numId w:val="1029"/>
+          <w:numId w:val="1030"/>
         </w:numPr>
         <w:pStyle w:val="Compact"/>
       </w:pPr>
@@ -6317,7 +6790,7 @@
       <w:pPr>
         <w:numPr>
           <w:ilvl w:val="0"/>
-          <w:numId w:val="1029"/>
+          <w:numId w:val="1030"/>
         </w:numPr>
         <w:pStyle w:val="Compact"/>
       </w:pPr>
@@ -6329,7 +6802,7 @@
       <w:pPr>
         <w:numPr>
           <w:ilvl w:val="0"/>
-          <w:numId w:val="1029"/>
+          <w:numId w:val="1030"/>
         </w:numPr>
         <w:pStyle w:val="Compact"/>
       </w:pPr>
@@ -6353,8 +6826,8 @@
         <w:t xml:space="preserve">Art. 60ter, Código Penal Art. 420bis, LFRA, CITES Appendix II coral (as cited in habitat prep)</w:t>
       </w:r>
     </w:p>
-    <w:bookmarkEnd w:id="123"/>
-    <w:bookmarkStart w:id="133" w:name="all-other-special-places"/>
+    <w:bookmarkEnd w:id="127"/>
+    <w:bookmarkStart w:id="137" w:name="all-other-special-places"/>
     <w:p>
       <w:pPr>
         <w:pStyle w:val="Heading3"/>
@@ -6375,7 +6848,7 @@
       <w:pPr>
         <w:numPr>
           <w:ilvl w:val="0"/>
-          <w:numId w:val="1030"/>
+          <w:numId w:val="1031"/>
         </w:numPr>
         <w:pStyle w:val="Compact"/>
       </w:pPr>
@@ -6387,7 +6860,7 @@
       <w:pPr>
         <w:numPr>
           <w:ilvl w:val="0"/>
-          <w:numId w:val="1030"/>
+          <w:numId w:val="1031"/>
         </w:numPr>
         <w:pStyle w:val="Compact"/>
       </w:pPr>
@@ -6397,7 +6870,7 @@
       <w:r>
         <w:t xml:space="preserve"> </w:t>
       </w:r>
-      <w:hyperlink r:id="rId72">
+      <w:hyperlink r:id="rId75">
         <w:r>
           <w:rPr>
             <w:rStyle w:val="Hyperlink"/>
@@ -6426,18 +6899,18 @@
           <wp:inline>
             <wp:extent cx="4533900" cy="4533900"/>
             <wp:effectExtent b="0" l="0" r="0" t="0"/>
-            <wp:docPr descr="Figure 21. Method map for all other special places: Expert Working Group marine locations that did not fit cleanly into parks, dive, fishing, archaeology, or habitat categories. Places that overlap a protected area take SIMEC i-efectividad or Ramsar plan condition when available. Places outside those managed boundaries use expert-reviewed codified legal protection scores compiled for this assessment (documented in the shared Google workbook). The map distinguishes sites inside versus outside protected areas so reviewers can see which scoring path applies where." title="" id="125" name="Picture"/>
+            <wp:docPr descr="Figure 21. Method map for all other special places: Expert Working Group marine locations that did not fit cleanly into special protected areas, dive, fishing, archaeology, or habitat categories. Places that overlap a protected area take SIMEC i-efectividad or Ramsar plan condition when available. Places outside those managed boundaries use expert-reviewed codified legal protection scores compiled for this assessment (documented in the shared Google workbook). The map distinguishes sites inside versus outside protected areas so reviewers can see which scoring path applies where." title="" id="129" name="Picture"/>
             <a:graphic>
               <a:graphicData uri="http://schemas.openxmlformats.org/drawingml/2006/picture">
                 <pic:pic>
                   <pic:nvPicPr>
-                    <pic:cNvPr descr="../images/sp_lsp_figs/process_all_other_special_places.png" id="126" name="Picture"/>
+                    <pic:cNvPr descr="../images/sp_lsp_figs/process_all_other_special_places.png" id="130" name="Picture"/>
                     <pic:cNvPicPr>
                       <a:picLocks noChangeArrowheads="1" noChangeAspect="1"/>
                     </pic:cNvPicPr>
                   </pic:nvPicPr>
                   <pic:blipFill>
-                    <a:blip r:embed="rId124"/>
+                    <a:blip r:embed="rId128"/>
                     <a:stretch>
                       <a:fillRect/>
                     </a:stretch>
@@ -6469,7 +6942,7 @@
         <w:pStyle w:val="ImageCaption"/>
       </w:pPr>
       <w:r>
-        <w:t xml:space="preserve">Figure 21. Method map for all other special places: Expert Working Group marine locations that did not fit cleanly into parks, dive, fishing, archaeology, or habitat categories. Places that overlap a protected area take SIMEC i-efectividad or Ramsar plan condition when available. Places outside those managed boundaries use expert-reviewed codified legal protection scores compiled for this assessment (documented in the shared Google workbook). The map distinguishes sites inside versus outside protected areas so reviewers can see which scoring path applies where.</w:t>
+        <w:t xml:space="preserve">Figure 21. Method map for all other special places: Expert Working Group marine locations that did not fit cleanly into special protected areas, dive, fishing, archaeology, or habitat categories. Places that overlap a protected area take SIMEC i-efectividad or Ramsar plan condition when available. Places outside those managed boundaries use expert-reviewed codified legal protection scores compiled for this assessment (documented in the shared Google workbook). The map distinguishes sites inside versus outside protected areas so reviewers can see which scoring path applies where.</w:t>
       </w:r>
     </w:p>
     <w:p>
@@ -6481,18 +6954,18 @@
           <wp:inline>
             <wp:extent cx="4000500" cy="4000499"/>
             <wp:effectExtent b="0" l="0" r="0" t="0"/>
-            <wp:docPr descr="Figure 22. Regional scores for the all-other-special-places category after park and codified-legal rules. This is the residual expert-place category that still contributes to Lasting Special Places when a location is important but does not belong in the other five buckets." title="" id="128" name="Picture"/>
+            <wp:docPr descr="Figure 22. Regional scores for the all-other-special-places category using the SIMEC i-efectividad and codified-legal rules. This is the residual expert category that still contributes to Lasting Special Places when a location is important but does not fall directly into any of the other five LSP types." title="" id="132" name="Picture"/>
             <a:graphic>
               <a:graphicData uri="http://schemas.openxmlformats.org/drawingml/2006/picture">
                 <pic:pic>
                   <pic:nvPicPr>
-                    <pic:cNvPr descr="../images/sp_lsp_figs/lsp_all_other_special_places.png" id="129" name="Picture"/>
+                    <pic:cNvPr descr="../images/sp_lsp_figs/lsp_all_other_special_places.png" id="133" name="Picture"/>
                     <pic:cNvPicPr>
                       <a:picLocks noChangeArrowheads="1" noChangeAspect="1"/>
                     </pic:cNvPicPr>
                   </pic:nvPicPr>
                   <pic:blipFill>
-                    <a:blip r:embed="rId127"/>
+                    <a:blip r:embed="rId131"/>
                     <a:stretch>
                       <a:fillRect/>
                     </a:stretch>
@@ -6524,7 +6997,7 @@
         <w:pStyle w:val="ImageCaption"/>
       </w:pPr>
       <w:r>
-        <w:t xml:space="preserve">Figure 22. Regional scores for the all-other-special-places category after park and codified-legal rules. This is the residual expert-place category that still contributes to Lasting Special Places when a location is important but does not belong in the other five buckets.</w:t>
+        <w:t xml:space="preserve">Figure 22. Regional scores for the all-other-special-places category using the SIMEC i-efectividad and codified-legal rules. This is the residual expert category that still contributes to Lasting Special Places when a location is important but does not fall directly into any of the other five LSP types.</w:t>
       </w:r>
     </w:p>
     <w:p>
@@ -6543,7 +7016,7 @@
       <w:pPr>
         <w:numPr>
           <w:ilvl w:val="0"/>
-          <w:numId w:val="1031"/>
+          <w:numId w:val="1032"/>
         </w:numPr>
         <w:pStyle w:val="Compact"/>
       </w:pPr>
@@ -6555,7 +7028,7 @@
       <w:pPr>
         <w:numPr>
           <w:ilvl w:val="0"/>
-          <w:numId w:val="1031"/>
+          <w:numId w:val="1032"/>
         </w:numPr>
         <w:pStyle w:val="Compact"/>
       </w:pPr>
@@ -6567,7 +7040,7 @@
       <w:pPr>
         <w:numPr>
           <w:ilvl w:val="0"/>
-          <w:numId w:val="1031"/>
+          <w:numId w:val="1032"/>
         </w:numPr>
         <w:pStyle w:val="Compact"/>
       </w:pPr>
@@ -6592,18 +7065,18 @@
           <wp:inline>
             <wp:extent cx="5334000" cy="5334000"/>
             <wp:effectExtent b="0" l="0" r="0" t="0"/>
-            <wp:docPr descr="Figure 23. Side-by-side regional scores for all six Lasting Special Places categories in the same prep exports and the same 0-100 scale. Panels cover special protected areas, priority dive sites, iconic fishing places, archaeological sites, special habitats, and all other special places. Use this figure to compare how regions perform across place types rather than only the single overall LSP mean in Figure 8." title="" id="131" name="Picture"/>
+            <wp:docPr descr="Figure 23. Side-by-side regional scores for all six Lasting Special Places categories in the same prep exports and the same 0-100 scale. Panels cover special protected areas, priority dive sites, iconic fishing places, archaeological sites, special habitats, and all other special places. Use this figure to compare how regions perform across place types rather than only the single overall LSP mean in Figure 8." title="" id="135" name="Picture"/>
             <a:graphic>
               <a:graphicData uri="http://schemas.openxmlformats.org/drawingml/2006/picture">
                 <pic:pic>
                   <pic:nvPicPr>
-                    <pic:cNvPr descr="../images/sp_lsp_figs/lsp_categories_panel.png" id="132" name="Picture"/>
+                    <pic:cNvPr descr="../images/sp_lsp_figs/lsp_categories_panel.png" id="136" name="Picture"/>
                     <pic:cNvPicPr>
                       <a:picLocks noChangeArrowheads="1" noChangeAspect="1"/>
                     </pic:cNvPicPr>
                   </pic:nvPicPr>
                   <pic:blipFill>
-                    <a:blip r:embed="rId130"/>
+                    <a:blip r:embed="rId134"/>
                     <a:stretch>
                       <a:fillRect/>
                     </a:stretch>
@@ -6653,10 +7126,10 @@
         </w:pict>
       </w:r>
     </w:p>
-    <w:bookmarkEnd w:id="133"/>
-    <w:bookmarkEnd w:id="134"/>
-    <w:bookmarkEnd w:id="135"/>
-    <w:bookmarkStart w:id="150" w:name="iconic-species-ico"/>
+    <w:bookmarkEnd w:id="137"/>
+    <w:bookmarkEnd w:id="138"/>
+    <w:bookmarkEnd w:id="139"/>
+    <w:bookmarkStart w:id="154" w:name="iconic-species-ico"/>
     <w:p>
       <w:pPr>
         <w:pStyle w:val="Heading1"/>
@@ -6673,7 +7146,7 @@
         <w:t xml:space="preserve">ICO measures the condition of species that are culturally iconic for Gulf communities.</w:t>
       </w:r>
     </w:p>
-    <w:bookmarkStart w:id="136" w:name="what-experts-were-asked-to-do"/>
+    <w:bookmarkStart w:id="140" w:name="what-experts-were-asked-to-do"/>
     <w:p>
       <w:pPr>
         <w:pStyle w:val="Heading2"/>
@@ -6724,7 +7197,7 @@
       <w:pPr>
         <w:numPr>
           <w:ilvl w:val="0"/>
-          <w:numId w:val="1032"/>
+          <w:numId w:val="1033"/>
         </w:numPr>
         <w:pStyle w:val="Compact"/>
       </w:pPr>
@@ -6754,7 +7227,7 @@
       <w:pPr>
         <w:numPr>
           <w:ilvl w:val="0"/>
-          <w:numId w:val="1032"/>
+          <w:numId w:val="1033"/>
         </w:numPr>
         <w:pStyle w:val="Compact"/>
       </w:pPr>
@@ -6766,7 +7239,7 @@
       <w:pPr>
         <w:numPr>
           <w:ilvl w:val="0"/>
-          <w:numId w:val="1032"/>
+          <w:numId w:val="1033"/>
         </w:numPr>
         <w:pStyle w:val="Compact"/>
       </w:pPr>
@@ -6790,7 +7263,7 @@
       <w:pPr>
         <w:numPr>
           <w:ilvl w:val="0"/>
-          <w:numId w:val="1033"/>
+          <w:numId w:val="1034"/>
         </w:numPr>
         <w:pStyle w:val="Compact"/>
       </w:pPr>
@@ -6802,7 +7275,7 @@
       <w:pPr>
         <w:numPr>
           <w:ilvl w:val="0"/>
-          <w:numId w:val="1033"/>
+          <w:numId w:val="1034"/>
         </w:numPr>
         <w:pStyle w:val="Compact"/>
       </w:pPr>
@@ -6814,7 +7287,7 @@
       <w:pPr>
         <w:numPr>
           <w:ilvl w:val="0"/>
-          <w:numId w:val="1033"/>
+          <w:numId w:val="1034"/>
         </w:numPr>
         <w:pStyle w:val="Compact"/>
       </w:pPr>
@@ -6830,8 +7303,8 @@
         <w:t xml:space="preserve">Habitat forming species and species harvested only for utilitarian commerce are outside this definition.</w:t>
       </w:r>
     </w:p>
-    <w:bookmarkEnd w:id="136"/>
-    <w:bookmarkStart w:id="149" w:name="how-ico-risk-weights-are-assigned"/>
+    <w:bookmarkEnd w:id="140"/>
+    <w:bookmarkStart w:id="153" w:name="how-ico-risk-weights-are-assigned"/>
     <w:p>
       <w:pPr>
         <w:pStyle w:val="Heading2"/>
@@ -6932,7 +7405,7 @@
       <w:pPr>
         <w:numPr>
           <w:ilvl w:val="0"/>
-          <w:numId w:val="1034"/>
+          <w:numId w:val="1035"/>
         </w:numPr>
         <w:pStyle w:val="Compact"/>
       </w:pPr>
@@ -6944,7 +7417,7 @@
       <w:pPr>
         <w:numPr>
           <w:ilvl w:val="0"/>
-          <w:numId w:val="1034"/>
+          <w:numId w:val="1035"/>
         </w:numPr>
         <w:pStyle w:val="Compact"/>
       </w:pPr>
@@ -6956,7 +7429,7 @@
       <w:pPr>
         <w:numPr>
           <w:ilvl w:val="0"/>
-          <w:numId w:val="1034"/>
+          <w:numId w:val="1035"/>
         </w:numPr>
         <w:pStyle w:val="Compact"/>
       </w:pPr>
@@ -6968,7 +7441,7 @@
       <w:pPr>
         <w:numPr>
           <w:ilvl w:val="0"/>
-          <w:numId w:val="1034"/>
+          <w:numId w:val="1035"/>
         </w:numPr>
         <w:pStyle w:val="Compact"/>
       </w:pPr>
@@ -7132,7 +7605,7 @@
       <w:pPr>
         <w:numPr>
           <w:ilvl w:val="0"/>
-          <w:numId w:val="1035"/>
+          <w:numId w:val="1036"/>
         </w:numPr>
         <w:pStyle w:val="Compact"/>
       </w:pPr>
@@ -7198,7 +7671,7 @@
       <w:pPr>
         <w:numPr>
           <w:ilvl w:val="0"/>
-          <w:numId w:val="1035"/>
+          <w:numId w:val="1036"/>
         </w:numPr>
         <w:pStyle w:val="Compact"/>
       </w:pPr>
@@ -7259,7 +7732,7 @@
       <w:pPr>
         <w:numPr>
           <w:ilvl w:val="0"/>
-          <w:numId w:val="1035"/>
+          <w:numId w:val="1036"/>
         </w:numPr>
         <w:pStyle w:val="Compact"/>
       </w:pPr>
@@ -7267,7 +7740,7 @@
         <w:t xml:space="preserve">The mean is taken across iconic species occurring in the region, then multiplied by 100 so the score is on a 0 to 100 scale</w:t>
       </w:r>
     </w:p>
-    <w:bookmarkStart w:id="137" w:name="nom-059-weights"/>
+    <w:bookmarkStart w:id="141" w:name="nom-059-weights"/>
     <w:p>
       <w:pPr>
         <w:pStyle w:val="Heading3"/>
@@ -7520,8 +7993,8 @@
         </w:tc>
       </w:tr>
     </w:tbl>
-    <w:bookmarkEnd w:id="137"/>
-    <w:bookmarkStart w:id="138" w:name="iucn-red-list-weights"/>
+    <w:bookmarkEnd w:id="141"/>
+    <w:bookmarkStart w:id="142" w:name="iucn-red-list-weights"/>
     <w:p>
       <w:pPr>
         <w:pStyle w:val="Heading3"/>
@@ -7851,8 +8324,8 @@
         </w:tc>
       </w:tr>
     </w:tbl>
-    <w:bookmarkEnd w:id="138"/>
-    <w:bookmarkStart w:id="148" w:name="cites-appendix-weights"/>
+    <w:bookmarkEnd w:id="142"/>
+    <w:bookmarkStart w:id="152" w:name="cites-appendix-weights"/>
     <w:p>
       <w:pPr>
         <w:pStyle w:val="Heading3"/>
@@ -8092,7 +8565,7 @@
       <w:pPr>
         <w:numPr>
           <w:ilvl w:val="0"/>
-          <w:numId w:val="1036"/>
+          <w:numId w:val="1037"/>
         </w:numPr>
         <w:pStyle w:val="Compact"/>
       </w:pPr>
@@ -8104,7 +8577,7 @@
       <w:pPr>
         <w:numPr>
           <w:ilvl w:val="0"/>
-          <w:numId w:val="1036"/>
+          <w:numId w:val="1037"/>
         </w:numPr>
         <w:pStyle w:val="Compact"/>
       </w:pPr>
@@ -8116,7 +8589,7 @@
       <w:pPr>
         <w:numPr>
           <w:ilvl w:val="0"/>
-          <w:numId w:val="1036"/>
+          <w:numId w:val="1037"/>
         </w:numPr>
         <w:pStyle w:val="Compact"/>
       </w:pPr>
@@ -8128,7 +8601,7 @@
       <w:pPr>
         <w:numPr>
           <w:ilvl w:val="0"/>
-          <w:numId w:val="1036"/>
+          <w:numId w:val="1037"/>
         </w:numPr>
         <w:pStyle w:val="Compact"/>
       </w:pPr>
@@ -8172,11 +8645,11 @@
       <w:pPr>
         <w:numPr>
           <w:ilvl w:val="0"/>
-          <w:numId w:val="1037"/>
-        </w:numPr>
-        <w:pStyle w:val="Compact"/>
-      </w:pPr>
-      <w:hyperlink r:id="rId139">
+          <w:numId w:val="1038"/>
+        </w:numPr>
+        <w:pStyle w:val="Compact"/>
+      </w:pPr>
+      <w:hyperlink r:id="rId143">
         <w:r>
           <w:rPr>
             <w:rStyle w:val="Hyperlink"/>
@@ -8189,11 +8662,11 @@
       <w:pPr>
         <w:numPr>
           <w:ilvl w:val="0"/>
-          <w:numId w:val="1037"/>
-        </w:numPr>
-        <w:pStyle w:val="Compact"/>
-      </w:pPr>
-      <w:hyperlink r:id="rId140">
+          <w:numId w:val="1038"/>
+        </w:numPr>
+        <w:pStyle w:val="Compact"/>
+      </w:pPr>
+      <w:hyperlink r:id="rId144">
         <w:r>
           <w:rPr>
             <w:rStyle w:val="Hyperlink"/>
@@ -8206,11 +8679,11 @@
       <w:pPr>
         <w:numPr>
           <w:ilvl w:val="0"/>
-          <w:numId w:val="1037"/>
-        </w:numPr>
-        <w:pStyle w:val="Compact"/>
-      </w:pPr>
-      <w:hyperlink r:id="rId141">
+          <w:numId w:val="1038"/>
+        </w:numPr>
+        <w:pStyle w:val="Compact"/>
+      </w:pPr>
+      <w:hyperlink r:id="rId145">
         <w:r>
           <w:rPr>
             <w:rStyle w:val="Hyperlink"/>
@@ -8228,18 +8701,18 @@
           <wp:inline>
             <wp:extent cx="5334000" cy="5334000"/>
             <wp:effectExtent b="0" l="0" r="0" t="0"/>
-            <wp:docPr descr="Figure 24. Iconic Species (ICO) current status by region for 2019-2025, the window we pair with CCE when building the overall Sense of Place series. For each region-year, ICO is 100 times the mean risk weight of culturally iconic species that occur in that region. Risk weights come from a hierarchy across Mexican NOM-059 categories, IUCN Red List status, and CITES listing, so more threatened status lowers the species weight and pulls the regional mean down. Species presence uses Gulf occurrence data from Morzaria-Luna et al. 2027, intersected with OHI marine regions and a 10 km inland buffer." title="" id="143" name="Picture"/>
+            <wp:docPr descr="Figure 24. Iconic Species (ICO) current status by region for 2019-2025, the window we pair with CCE when building the overall Sense of Place series. For each region-year, ICO is 100 times the mean risk weight of culturally iconic species that occur in that region. Risk weights come from a hierarchy across Mexican NOM-059 categories, IUCN Red List status, and CITES listing, so more threatened status lowers the species weight and pulls the regional mean down. Species presence uses Gulf occurrence data from Morzaria-Luna et al. 2027, intersected with OHI marine regions and a 10 km inland buffer." title="" id="147" name="Picture"/>
             <a:graphic>
               <a:graphicData uri="http://schemas.openxmlformats.org/drawingml/2006/picture">
                 <pic:pic>
                   <pic:nvPicPr>
-                    <pic:cNvPr descr="ewg32_sp_docx_files/figure-docx/unnamed-chunk-26-1.png" id="144" name="Picture"/>
+                    <pic:cNvPr descr="ewg32_sp_docx_files/figure-docx/unnamed-chunk-26-1.png" id="148" name="Picture"/>
                     <pic:cNvPicPr>
                       <a:picLocks noChangeArrowheads="1" noChangeAspect="1"/>
                     </pic:cNvPicPr>
                   </pic:nvPicPr>
                   <pic:blipFill>
-                    <a:blip r:embed="rId142"/>
+                    <a:blip r:embed="rId146"/>
                     <a:stretch>
                       <a:fillRect/>
                     </a:stretch>
@@ -8283,18 +8756,18 @@
           <wp:inline>
             <wp:extent cx="5334000" cy="5334000"/>
             <wp:effectExtent b="0" l="0" r="0" t="0"/>
-            <wp:docPr descr="Figure 25. Full Iconic Species time series by region from 2010 through 2025, using the same risk-weight method as Figure 24. This longer window shows how NOM-059, IUCN, and CITES status changes over time affect regional ICO scores beyond the shorter 2019-2025 SP reporting period." title="" id="146" name="Picture"/>
+            <wp:docPr descr="Figure 25. Full Iconic Species time series by region from 2010 through 2025, using the same risk-weight method as Figure 24. This longer window shows how NOM-059, IUCN, and CITES status changes over time affect regional ICO scores beyond the shorter 2019-2025 SP reporting period." title="" id="150" name="Picture"/>
             <a:graphic>
               <a:graphicData uri="http://schemas.openxmlformats.org/drawingml/2006/picture">
                 <pic:pic>
                   <pic:nvPicPr>
-                    <pic:cNvPr descr="ewg32_sp_docx_files/figure-docx/unnamed-chunk-27-1.png" id="147" name="Picture"/>
+                    <pic:cNvPr descr="ewg32_sp_docx_files/figure-docx/unnamed-chunk-27-1.png" id="151" name="Picture"/>
                     <pic:cNvPicPr>
                       <a:picLocks noChangeArrowheads="1" noChangeAspect="1"/>
                     </pic:cNvPicPr>
                   </pic:nvPicPr>
                   <pic:blipFill>
-                    <a:blip r:embed="rId145"/>
+                    <a:blip r:embed="rId149"/>
                     <a:stretch>
                       <a:fillRect/>
                     </a:stretch>
@@ -8336,10 +8809,10 @@
         </w:pict>
       </w:r>
     </w:p>
-    <w:bookmarkEnd w:id="148"/>
-    <w:bookmarkEnd w:id="149"/>
-    <w:bookmarkEnd w:id="150"/>
-    <w:bookmarkStart w:id="151" w:name="topics-for-discussion"/>
+    <w:bookmarkEnd w:id="152"/>
+    <w:bookmarkEnd w:id="153"/>
+    <w:bookmarkEnd w:id="154"/>
+    <w:bookmarkStart w:id="155" w:name="topics-for-discussion"/>
     <w:p>
       <w:pPr>
         <w:pStyle w:val="Heading1"/>
@@ -8353,7 +8826,7 @@
         <w:pStyle w:val="FirstParagraph"/>
       </w:pPr>
       <w:r>
-        <w:t xml:space="preserve">Please discuss these items with the group at EWG 3.2. We are especially interested in your feedback on the</w:t>
+        <w:t xml:space="preserve">We plan to discuss these items with the group at EWG 3.2, though we encourage feedback prior to or after the meeting as well. We are especially interested in your feedback on the</w:t>
       </w:r>
       <w:r>
         <w:t xml:space="preserve"> </w:t>
@@ -8369,14 +8842,14 @@
         <w:t xml:space="preserve"> </w:t>
       </w:r>
       <w:r>
-        <w:t xml:space="preserve">(categories, protections, floors, and data sources) in the LSP section above.</w:t>
-      </w:r>
-    </w:p>
-    <w:p>
-      <w:pPr>
-        <w:numPr>
-          <w:ilvl w:val="0"/>
-          <w:numId w:val="1038"/>
+        <w:t xml:space="preserve">(categories, protections, floors, and data sources) in the LSP section above. Additionally, if you have any opinions on these topics:</w:t>
+      </w:r>
+    </w:p>
+    <w:p>
+      <w:pPr>
+        <w:numPr>
+          <w:ilvl w:val="0"/>
+          <w:numId w:val="1039"/>
         </w:numPr>
       </w:pPr>
       <w:r>
@@ -8390,14 +8863,14 @@
         <w:t xml:space="preserve"> </w:t>
       </w:r>
       <w:r>
-        <w:t xml:space="preserve">Confirm whether equal weights are the final intended policy choice, or whether any subgoal should be weighted differently.</w:t>
-      </w:r>
-    </w:p>
-    <w:p>
-      <w:pPr>
-        <w:numPr>
-          <w:ilvl w:val="0"/>
-          <w:numId w:val="1038"/>
+        <w:t xml:space="preserve">Confirm whether equal weights are the final choice, or whether any subgoal should be weighted differently.</w:t>
+      </w:r>
+    </w:p>
+    <w:p>
+      <w:pPr>
+        <w:numPr>
+          <w:ilvl w:val="0"/>
+          <w:numId w:val="1039"/>
         </w:numPr>
       </w:pPr>
       <w:r>
@@ -8405,20 +8878,20 @@
           <w:bCs/>
           <w:b/>
         </w:rPr>
-        <w:t xml:space="preserve">Dive site unprotected floor (currently 58) and coquina legal floor (currently 30).</w:t>
-      </w:r>
-      <w:r>
-        <w:t xml:space="preserve"> </w:t>
-      </w:r>
-      <w:r>
-        <w:t xml:space="preserve">Confirm whether these floors remain the intended defaults, or whether EWG 3.2 prefers another approach.</w:t>
-      </w:r>
-    </w:p>
-    <w:p>
-      <w:pPr>
-        <w:numPr>
-          <w:ilvl w:val="0"/>
-          <w:numId w:val="1038"/>
+        <w:t xml:space="preserve">Dive site statute-based minimum outside protected areas (currently 58) and coquina statute-based minimum (currently 30).</w:t>
+      </w:r>
+      <w:r>
+        <w:t xml:space="preserve"> </w:t>
+      </w:r>
+      <w:r>
+        <w:t xml:space="preserve">Confirm whether these defaults remain the intended values, or whether the group prefers another approach.</w:t>
+      </w:r>
+    </w:p>
+    <w:p>
+      <w:pPr>
+        <w:numPr>
+          <w:ilvl w:val="0"/>
+          <w:numId w:val="1039"/>
         </w:numPr>
       </w:pPr>
       <w:r>
@@ -8439,11 +8912,11 @@
       <w:pPr>
         <w:numPr>
           <w:ilvl w:val="1"/>
-          <w:numId w:val="1039"/>
-        </w:numPr>
-        <w:pStyle w:val="Compact"/>
-      </w:pPr>
-      <w:hyperlink r:id="rId139">
+          <w:numId w:val="1040"/>
+        </w:numPr>
+        <w:pStyle w:val="Compact"/>
+      </w:pPr>
+      <w:hyperlink r:id="rId143">
         <w:r>
           <w:rPr>
             <w:rStyle w:val="Hyperlink"/>
@@ -8456,11 +8929,11 @@
       <w:pPr>
         <w:numPr>
           <w:ilvl w:val="1"/>
-          <w:numId w:val="1039"/>
-        </w:numPr>
-        <w:pStyle w:val="Compact"/>
-      </w:pPr>
-      <w:hyperlink r:id="rId140">
+          <w:numId w:val="1040"/>
+        </w:numPr>
+        <w:pStyle w:val="Compact"/>
+      </w:pPr>
+      <w:hyperlink r:id="rId144">
         <w:r>
           <w:rPr>
             <w:rStyle w:val="Hyperlink"/>
@@ -8473,11 +8946,11 @@
       <w:pPr>
         <w:numPr>
           <w:ilvl w:val="1"/>
-          <w:numId w:val="1039"/>
-        </w:numPr>
-        <w:pStyle w:val="Compact"/>
-      </w:pPr>
-      <w:hyperlink r:id="rId141">
+          <w:numId w:val="1040"/>
+        </w:numPr>
+        <w:pStyle w:val="Compact"/>
+      </w:pPr>
+      <w:hyperlink r:id="rId145">
         <w:r>
           <w:rPr>
             <w:rStyle w:val="Hyperlink"/>
@@ -8490,7 +8963,7 @@
       <w:pPr>
         <w:numPr>
           <w:ilvl w:val="0"/>
-          <w:numId w:val="1038"/>
+          <w:numId w:val="1039"/>
         </w:numPr>
       </w:pPr>
       <w:r>
@@ -8525,8 +8998,8 @@
         </w:pict>
       </w:r>
     </w:p>
-    <w:bookmarkEnd w:id="151"/>
-    <w:bookmarkStart w:id="153" w:name="related-goalkeeper-page"/>
+    <w:bookmarkEnd w:id="155"/>
+    <w:bookmarkStart w:id="157" w:name="related-goalkeeper-page"/>
     <w:p>
       <w:pPr>
         <w:pStyle w:val="Heading1"/>
@@ -8545,7 +9018,7 @@
       <w:r>
         <w:t xml:space="preserve"> </w:t>
       </w:r>
-      <w:hyperlink r:id="rId152">
+      <w:hyperlink r:id="rId156">
         <w:r>
           <w:rPr>
             <w:rStyle w:val="Hyperlink"/>
@@ -8557,7 +9030,7 @@
         <w:t xml:space="preserve">.</w:t>
       </w:r>
     </w:p>
-    <w:bookmarkEnd w:id="153"/>
+    <w:bookmarkEnd w:id="157"/>
     <w:sectPr/>
   </w:body>
 </w:document>
@@ -9030,9 +9503,39 @@
     </w:lvlOverride>
   </w:num>
   <w:num w:numId="1023">
+    <w:abstractNumId w:val="99411"/>
+    <w:lvlOverride w:ilvl="0">
+      <w:startOverride w:val="1"/>
+    </w:lvlOverride>
+    <w:lvlOverride w:ilvl="1">
+      <w:startOverride w:val="1"/>
+    </w:lvlOverride>
+    <w:lvlOverride w:ilvl="2">
+      <w:startOverride w:val="1"/>
+    </w:lvlOverride>
+    <w:lvlOverride w:ilvl="3">
+      <w:startOverride w:val="1"/>
+    </w:lvlOverride>
+    <w:lvlOverride w:ilvl="4">
+      <w:startOverride w:val="1"/>
+    </w:lvlOverride>
+    <w:lvlOverride w:ilvl="5">
+      <w:startOverride w:val="1"/>
+    </w:lvlOverride>
+    <w:lvlOverride w:ilvl="6">
+      <w:startOverride w:val="1"/>
+    </w:lvlOverride>
+    <w:lvlOverride w:ilvl="7">
+      <w:startOverride w:val="1"/>
+    </w:lvlOverride>
+    <w:lvlOverride w:ilvl="8">
+      <w:startOverride w:val="1"/>
+    </w:lvlOverride>
+  </w:num>
+  <w:num w:numId="1024">
     <w:abstractNumId w:val="991"/>
   </w:num>
-  <w:num w:numId="1024">
+  <w:num w:numId="1025">
     <w:abstractNumId w:val="99411"/>
     <w:lvlOverride w:ilvl="0">
       <w:startOverride w:val="1"/>
@@ -9062,10 +9565,10 @@
       <w:startOverride w:val="1"/>
     </w:lvlOverride>
   </w:num>
-  <w:num w:numId="1025">
+  <w:num w:numId="1026">
     <w:abstractNumId w:val="991"/>
   </w:num>
-  <w:num w:numId="1026">
+  <w:num w:numId="1027">
     <w:abstractNumId w:val="99411"/>
     <w:lvlOverride w:ilvl="0">
       <w:startOverride w:val="1"/>
@@ -9095,10 +9598,10 @@
       <w:startOverride w:val="1"/>
     </w:lvlOverride>
   </w:num>
-  <w:num w:numId="1027">
+  <w:num w:numId="1028">
     <w:abstractNumId w:val="991"/>
   </w:num>
-  <w:num w:numId="1028">
+  <w:num w:numId="1029">
     <w:abstractNumId w:val="99411"/>
     <w:lvlOverride w:ilvl="0">
       <w:startOverride w:val="1"/>
@@ -9128,10 +9631,10 @@
       <w:startOverride w:val="1"/>
     </w:lvlOverride>
   </w:num>
-  <w:num w:numId="1029">
+  <w:num w:numId="1030">
     <w:abstractNumId w:val="991"/>
   </w:num>
-  <w:num w:numId="1030">
+  <w:num w:numId="1031">
     <w:abstractNumId w:val="99411"/>
     <w:lvlOverride w:ilvl="0">
       <w:startOverride w:val="1"/>
@@ -9161,10 +9664,10 @@
       <w:startOverride w:val="1"/>
     </w:lvlOverride>
   </w:num>
-  <w:num w:numId="1031">
+  <w:num w:numId="1032">
     <w:abstractNumId w:val="991"/>
   </w:num>
-  <w:num w:numId="1032">
+  <w:num w:numId="1033">
     <w:abstractNumId w:val="99411"/>
     <w:lvlOverride w:ilvl="0">
       <w:startOverride w:val="1"/>
@@ -9194,10 +9697,10 @@
       <w:startOverride w:val="1"/>
     </w:lvlOverride>
   </w:num>
-  <w:num w:numId="1033">
+  <w:num w:numId="1034">
     <w:abstractNumId w:val="991"/>
   </w:num>
-  <w:num w:numId="1034">
+  <w:num w:numId="1035">
     <w:abstractNumId w:val="99411"/>
     <w:lvlOverride w:ilvl="0">
       <w:startOverride w:val="1"/>
@@ -9226,9 +9729,6 @@
     <w:lvlOverride w:ilvl="8">
       <w:startOverride w:val="1"/>
     </w:lvlOverride>
-  </w:num>
-  <w:num w:numId="1035">
-    <w:abstractNumId w:val="991"/>
   </w:num>
   <w:num w:numId="1036">
     <w:abstractNumId w:val="991"/>
@@ -9237,6 +9737,9 @@
     <w:abstractNumId w:val="991"/>
   </w:num>
   <w:num w:numId="1038">
+    <w:abstractNumId w:val="991"/>
+  </w:num>
+  <w:num w:numId="1039">
     <w:abstractNumId w:val="99411"/>
     <w:lvlOverride w:ilvl="0">
       <w:startOverride w:val="1"/>
@@ -9266,7 +9769,7 @@
       <w:startOverride w:val="1"/>
     </w:lvlOverride>
   </w:num>
-  <w:num w:numId="1039">
+  <w:num w:numId="1040">
     <w:abstractNumId w:val="991"/>
   </w:num>
 </w:numbering>

</xml_diff>